<commit_message>
Update documentation file format and content
</commit_message>
<xml_diff>
--- a/FleetFlow_documentation.docx
+++ b/FleetFlow_documentation.docx
@@ -10,6 +10,8 @@
           <w:sz w:val="44"/>
         </w:rPr>
       </w:pPr>
+      <w:bookmarkStart w:id="0" w:name="_GoBack"/>
+      <w:bookmarkEnd w:id="0"/>
     </w:p>
     <w:p>
       <w:pPr>
@@ -810,8 +812,6 @@
           <w:sz w:val="22"/>
         </w:rPr>
       </w:pPr>
-      <w:bookmarkStart w:id="0" w:name="_GoBack"/>
-      <w:bookmarkEnd w:id="0"/>
     </w:p>
     <w:p>
       <w:pPr>
@@ -2277,7 +2277,6 @@
         <w:alias w:val="Tartalomjegyzék"/>
         <w:id w:val="112560769"/>
       </w:sdtPr>
-      <w:sdtEndPr/>
       <w:sdtContent>
         <w:p>
           <w:pPr>

</xml_diff>

<commit_message>
Fix formatting issues and update section numbers in documentation
</commit_message>
<xml_diff>
--- a/FleetFlow_documentation.docx
+++ b/FleetFlow_documentation.docx
@@ -10,8 +10,6 @@
           <w:sz w:val="44"/>
         </w:rPr>
       </w:pPr>
-      <w:bookmarkStart w:id="0" w:name="_GoBack"/>
-      <w:bookmarkEnd w:id="0"/>
     </w:p>
     <w:p>
       <w:pPr>
@@ -26,6 +24,14 @@
         </w:rPr>
         <w:t>Záródolgozat feladatkiírás</w:t>
       </w:r>
+      <w:r>
+        <w:rPr>
+          <w:rFonts w:ascii="Cambria" w:eastAsia="Cambria" w:hAnsi="Cambria" w:cs="Cambria"/>
+          <w:b/>
+          <w:sz w:val="44"/>
+        </w:rPr>
+        <w:t xml:space="preserve"> </w:t>
+      </w:r>
     </w:p>
     <w:p>
       <w:pPr>
@@ -97,6 +103,13 @@
           <w:sz w:val="24"/>
         </w:rPr>
         <w:t>nappali</w:t>
+      </w:r>
+      <w:r>
+        <w:rPr>
+          <w:rFonts w:ascii="Cambria" w:eastAsia="Cambria" w:hAnsi="Cambria" w:cs="Cambria"/>
+          <w:sz w:val="24"/>
+        </w:rPr>
+        <w:t xml:space="preserve"> </w:t>
       </w:r>
     </w:p>
     <w:p>
@@ -463,7 +476,14 @@
                 <w:rFonts w:ascii="Cambria" w:eastAsia="Cambria" w:hAnsi="Cambria" w:cs="Cambria"/>
                 <w:sz w:val="24"/>
               </w:rPr>
-              <w:t xml:space="preserve">Konzulens:  </w:t>
+              <w:t>Konzulens:</w:t>
+            </w:r>
+            <w:r>
+              <w:rPr>
+                <w:rFonts w:ascii="Cambria" w:eastAsia="Cambria" w:hAnsi="Cambria" w:cs="Cambria"/>
+                <w:sz w:val="24"/>
+              </w:rPr>
+              <w:t xml:space="preserve"> </w:t>
             </w:r>
           </w:p>
         </w:tc>
@@ -542,7 +562,7 @@
                 <w:rFonts w:ascii="Cambria" w:eastAsia="Cambria" w:hAnsi="Cambria" w:cs="Cambria"/>
                 <w:sz w:val="24"/>
               </w:rPr>
-              <w:t xml:space="preserve"> határidő:  </w:t>
+              <w:t xml:space="preserve"> határidő: </w:t>
             </w:r>
           </w:p>
           <w:p>
@@ -585,7 +605,14 @@
                 <w:rFonts w:ascii="Cambria" w:eastAsia="Cambria" w:hAnsi="Cambria" w:cs="Cambria"/>
                 <w:sz w:val="24"/>
               </w:rPr>
-              <w:t xml:space="preserve">. </w:t>
+              <w:t>.</w:t>
+            </w:r>
+            <w:r>
+              <w:rPr>
+                <w:rFonts w:ascii="Cambria" w:eastAsia="Cambria" w:hAnsi="Cambria" w:cs="Cambria"/>
+                <w:sz w:val="24"/>
+              </w:rPr>
+              <w:t xml:space="preserve"> </w:t>
             </w:r>
           </w:p>
           <w:p/>
@@ -855,6 +882,8 @@
         <w:ind w:left="44"/>
         <w:jc w:val="center"/>
         <w:rPr>
+          <w:rFonts w:ascii="Cambria" w:eastAsia="Cambria" w:hAnsi="Cambria" w:cs="Cambria"/>
+          <w:b/>
           <w:sz w:val="44"/>
         </w:rPr>
       </w:pPr>
@@ -879,6 +908,14 @@
           <w:sz w:val="44"/>
         </w:rPr>
         <w:t>lap</w:t>
+      </w:r>
+      <w:r>
+        <w:rPr>
+          <w:rFonts w:ascii="Cambria" w:eastAsia="Cambria" w:hAnsi="Cambria" w:cs="Cambria"/>
+          <w:b/>
+          <w:sz w:val="44"/>
+        </w:rPr>
+        <w:t xml:space="preserve"> </w:t>
       </w:r>
     </w:p>
     <w:p/>
@@ -1989,6 +2026,13 @@
           <w:sz w:val="24"/>
         </w:rPr>
         <w:t xml:space="preserve"> április 15.</w:t>
+      </w:r>
+      <w:r>
+        <w:rPr>
+          <w:rFonts w:ascii="Cambria" w:eastAsia="Cambria" w:hAnsi="Cambria" w:cs="Cambria"/>
+          <w:sz w:val="24"/>
+        </w:rPr>
+        <w:t xml:space="preserve"> </w:t>
       </w:r>
     </w:p>
     <w:p>
@@ -2226,26 +2270,6 @@
       <w:pPr>
         <w:spacing w:after="582" w:line="249" w:lineRule="auto"/>
         <w:ind w:left="6142" w:right="35" w:hanging="10"/>
-      </w:pPr>
-      <w:r>
-        <w:rPr>
-          <w:rFonts w:ascii="Cambria" w:eastAsia="Cambria" w:hAnsi="Cambria" w:cs="Cambria"/>
-          <w:sz w:val="24"/>
-        </w:rPr>
-        <w:t xml:space="preserve">tanuló aláírása  </w:t>
-      </w:r>
-    </w:p>
-    <w:p>
-      <w:pPr>
-        <w:spacing w:after="240"/>
-        <w:jc w:val="center"/>
-        <w:rPr>
-          <w:b/>
-          <w:bCs/>
-          <w:color w:val="000000"/>
-          <w:sz w:val="36"/>
-          <w:szCs w:val="36"/>
-        </w:rPr>
         <w:sectPr>
           <w:headerReference w:type="default" r:id="rId7"/>
           <w:pgSz w:w="11906" w:h="16838"/>
@@ -2254,6 +2278,16 @@
           <w:docGrid w:linePitch="360"/>
         </w:sectPr>
       </w:pPr>
+      <w:r>
+        <w:rPr>
+          <w:rFonts w:ascii="Cambria" w:eastAsia="Cambria" w:hAnsi="Cambria" w:cs="Cambria"/>
+          <w:sz w:val="24"/>
+        </w:rPr>
+        <w:t xml:space="preserve">tanuló aláírása  </w:t>
+      </w:r>
+      <w:r>
+        <w:t xml:space="preserve">  </w:t>
+      </w:r>
     </w:p>
     <w:p>
       <w:pPr>
@@ -2300,7 +2334,7 @@
           <w:r>
             <w:fldChar w:fldCharType="separate"/>
           </w:r>
-          <w:hyperlink w:anchor="_Toc226474408" w:history="1">
+          <w:hyperlink w:anchor="_Toc227147725" w:history="1">
             <w:r>
               <w:rPr>
                 <w:rStyle w:val="Hiperhivatkozs"/>
@@ -2324,7 +2358,7 @@
               <w:rPr>
                 <w:noProof/>
               </w:rPr>
-              <w:instrText xml:space="preserve"> PAGEREF _Toc226474408 \h </w:instrText>
+              <w:instrText xml:space="preserve"> PAGEREF _Toc227147725 \h </w:instrText>
             </w:r>
             <w:r>
               <w:rPr>
@@ -2364,7 +2398,7 @@
               <w:szCs w:val="22"/>
             </w:rPr>
           </w:pPr>
-          <w:hyperlink w:anchor="_Toc226474409" w:history="1">
+          <w:hyperlink w:anchor="_Toc227147726" w:history="1">
             <w:r>
               <w:rPr>
                 <w:rStyle w:val="Hiperhivatkozs"/>
@@ -2388,7 +2422,7 @@
               <w:rPr>
                 <w:noProof/>
               </w:rPr>
-              <w:instrText xml:space="preserve"> PAGEREF _Toc226474409 \h </w:instrText>
+              <w:instrText xml:space="preserve"> PAGEREF _Toc227147726 \h </w:instrText>
             </w:r>
             <w:r>
               <w:rPr>
@@ -2428,7 +2462,7 @@
               <w:szCs w:val="22"/>
             </w:rPr>
           </w:pPr>
-          <w:hyperlink w:anchor="_Toc226474410" w:history="1">
+          <w:hyperlink w:anchor="_Toc227147727" w:history="1">
             <w:r>
               <w:rPr>
                 <w:rStyle w:val="Hiperhivatkozs"/>
@@ -2452,7 +2486,7 @@
               <w:rPr>
                 <w:noProof/>
               </w:rPr>
-              <w:instrText xml:space="preserve"> PAGEREF _Toc226474410 \h </w:instrText>
+              <w:instrText xml:space="preserve"> PAGEREF _Toc227147727 \h </w:instrText>
             </w:r>
             <w:r>
               <w:rPr>
@@ -2492,7 +2526,7 @@
               <w:szCs w:val="22"/>
             </w:rPr>
           </w:pPr>
-          <w:hyperlink w:anchor="_Toc226474411" w:history="1">
+          <w:hyperlink w:anchor="_Toc227147728" w:history="1">
             <w:r>
               <w:rPr>
                 <w:rStyle w:val="Hiperhivatkozs"/>
@@ -2516,7 +2550,7 @@
               <w:rPr>
                 <w:noProof/>
               </w:rPr>
-              <w:instrText xml:space="preserve"> PAGEREF _Toc226474411 \h </w:instrText>
+              <w:instrText xml:space="preserve"> PAGEREF _Toc227147728 \h </w:instrText>
             </w:r>
             <w:r>
               <w:rPr>
@@ -2556,7 +2590,7 @@
               <w:szCs w:val="22"/>
             </w:rPr>
           </w:pPr>
-          <w:hyperlink w:anchor="_Toc226474412" w:history="1">
+          <w:hyperlink w:anchor="_Toc227147729" w:history="1">
             <w:r>
               <w:rPr>
                 <w:rStyle w:val="Hiperhivatkozs"/>
@@ -2580,7 +2614,7 @@
               <w:rPr>
                 <w:noProof/>
               </w:rPr>
-              <w:instrText xml:space="preserve"> PAGEREF _Toc226474412 \h </w:instrText>
+              <w:instrText xml:space="preserve"> PAGEREF _Toc227147729 \h </w:instrText>
             </w:r>
             <w:r>
               <w:rPr>
@@ -2620,7 +2654,7 @@
               <w:szCs w:val="22"/>
             </w:rPr>
           </w:pPr>
-          <w:hyperlink w:anchor="_Toc226474413" w:history="1">
+          <w:hyperlink w:anchor="_Toc227147730" w:history="1">
             <w:r>
               <w:rPr>
                 <w:rStyle w:val="Hiperhivatkozs"/>
@@ -2644,7 +2678,7 @@
               <w:rPr>
                 <w:noProof/>
               </w:rPr>
-              <w:instrText xml:space="preserve"> PAGEREF _Toc226474413 \h </w:instrText>
+              <w:instrText xml:space="preserve"> PAGEREF _Toc227147730 \h </w:instrText>
             </w:r>
             <w:r>
               <w:rPr>
@@ -2684,7 +2718,7 @@
               <w:szCs w:val="22"/>
             </w:rPr>
           </w:pPr>
-          <w:hyperlink w:anchor="_Toc226474414" w:history="1">
+          <w:hyperlink w:anchor="_Toc227147731" w:history="1">
             <w:r>
               <w:rPr>
                 <w:rStyle w:val="Hiperhivatkozs"/>
@@ -2708,7 +2742,7 @@
               <w:rPr>
                 <w:noProof/>
               </w:rPr>
-              <w:instrText xml:space="preserve"> PAGEREF _Toc226474414 \h </w:instrText>
+              <w:instrText xml:space="preserve"> PAGEREF _Toc227147731 \h </w:instrText>
             </w:r>
             <w:r>
               <w:rPr>
@@ -2748,7 +2782,7 @@
               <w:szCs w:val="22"/>
             </w:rPr>
           </w:pPr>
-          <w:hyperlink w:anchor="_Toc226474415" w:history="1">
+          <w:hyperlink w:anchor="_Toc227147732" w:history="1">
             <w:r>
               <w:rPr>
                 <w:rStyle w:val="Hiperhivatkozs"/>
@@ -2772,7 +2806,7 @@
               <w:rPr>
                 <w:noProof/>
               </w:rPr>
-              <w:instrText xml:space="preserve"> PAGEREF _Toc226474415 \h </w:instrText>
+              <w:instrText xml:space="preserve"> PAGEREF _Toc227147732 \h </w:instrText>
             </w:r>
             <w:r>
               <w:rPr>
@@ -2812,7 +2846,7 @@
               <w:szCs w:val="22"/>
             </w:rPr>
           </w:pPr>
-          <w:hyperlink w:anchor="_Toc226474416" w:history="1">
+          <w:hyperlink w:anchor="_Toc227147733" w:history="1">
             <w:r>
               <w:rPr>
                 <w:rStyle w:val="Hiperhivatkozs"/>
@@ -2836,7 +2870,7 @@
               <w:rPr>
                 <w:noProof/>
               </w:rPr>
-              <w:instrText xml:space="preserve"> PAGEREF _Toc226474416 \h </w:instrText>
+              <w:instrText xml:space="preserve"> PAGEREF _Toc227147733 \h </w:instrText>
             </w:r>
             <w:r>
               <w:rPr>
@@ -2876,7 +2910,7 @@
               <w:szCs w:val="22"/>
             </w:rPr>
           </w:pPr>
-          <w:hyperlink w:anchor="_Toc226474417" w:history="1">
+          <w:hyperlink w:anchor="_Toc227147734" w:history="1">
             <w:r>
               <w:rPr>
                 <w:rStyle w:val="Hiperhivatkozs"/>
@@ -2900,7 +2934,7 @@
               <w:rPr>
                 <w:noProof/>
               </w:rPr>
-              <w:instrText xml:space="preserve"> PAGEREF _Toc226474417 \h </w:instrText>
+              <w:instrText xml:space="preserve"> PAGEREF _Toc227147734 \h </w:instrText>
             </w:r>
             <w:r>
               <w:rPr>
@@ -2940,7 +2974,7 @@
               <w:szCs w:val="22"/>
             </w:rPr>
           </w:pPr>
-          <w:hyperlink w:anchor="_Toc226474418" w:history="1">
+          <w:hyperlink w:anchor="_Toc227147735" w:history="1">
             <w:r>
               <w:rPr>
                 <w:rStyle w:val="Hiperhivatkozs"/>
@@ -2964,7 +2998,7 @@
               <w:rPr>
                 <w:noProof/>
               </w:rPr>
-              <w:instrText xml:space="preserve"> PAGEREF _Toc226474418 \h </w:instrText>
+              <w:instrText xml:space="preserve"> PAGEREF _Toc227147735 \h </w:instrText>
             </w:r>
             <w:r>
               <w:rPr>
@@ -3004,7 +3038,7 @@
               <w:szCs w:val="22"/>
             </w:rPr>
           </w:pPr>
-          <w:hyperlink w:anchor="_Toc226474419" w:history="1">
+          <w:hyperlink w:anchor="_Toc227147736" w:history="1">
             <w:r>
               <w:rPr>
                 <w:rStyle w:val="Hiperhivatkozs"/>
@@ -3028,7 +3062,7 @@
               <w:rPr>
                 <w:noProof/>
               </w:rPr>
-              <w:instrText xml:space="preserve"> PAGEREF _Toc226474419 \h </w:instrText>
+              <w:instrText xml:space="preserve"> PAGEREF _Toc227147736 \h </w:instrText>
             </w:r>
             <w:r>
               <w:rPr>
@@ -3068,7 +3102,7 @@
               <w:szCs w:val="22"/>
             </w:rPr>
           </w:pPr>
-          <w:hyperlink w:anchor="_Toc226474420" w:history="1">
+          <w:hyperlink w:anchor="_Toc227147737" w:history="1">
             <w:r>
               <w:rPr>
                 <w:rStyle w:val="Hiperhivatkozs"/>
@@ -3092,7 +3126,7 @@
               <w:rPr>
                 <w:noProof/>
               </w:rPr>
-              <w:instrText xml:space="preserve"> PAGEREF _Toc226474420 \h </w:instrText>
+              <w:instrText xml:space="preserve"> PAGEREF _Toc227147737 \h </w:instrText>
             </w:r>
             <w:r>
               <w:rPr>
@@ -3132,7 +3166,7 @@
               <w:szCs w:val="22"/>
             </w:rPr>
           </w:pPr>
-          <w:hyperlink w:anchor="_Toc226474421" w:history="1">
+          <w:hyperlink w:anchor="_Toc227147738" w:history="1">
             <w:r>
               <w:rPr>
                 <w:rStyle w:val="Hiperhivatkozs"/>
@@ -3156,7 +3190,7 @@
               <w:rPr>
                 <w:noProof/>
               </w:rPr>
-              <w:instrText xml:space="preserve"> PAGEREF _Toc226474421 \h </w:instrText>
+              <w:instrText xml:space="preserve"> PAGEREF _Toc227147738 \h </w:instrText>
             </w:r>
             <w:r>
               <w:rPr>
@@ -3196,7 +3230,7 @@
               <w:szCs w:val="22"/>
             </w:rPr>
           </w:pPr>
-          <w:hyperlink w:anchor="_Toc226474422" w:history="1">
+          <w:hyperlink w:anchor="_Toc227147739" w:history="1">
             <w:r>
               <w:rPr>
                 <w:rStyle w:val="Hiperhivatkozs"/>
@@ -3220,7 +3254,7 @@
               <w:rPr>
                 <w:noProof/>
               </w:rPr>
-              <w:instrText xml:space="preserve"> PAGEREF _Toc226474422 \h </w:instrText>
+              <w:instrText xml:space="preserve"> PAGEREF _Toc227147739 \h </w:instrText>
             </w:r>
             <w:r>
               <w:rPr>
@@ -3260,7 +3294,7 @@
               <w:szCs w:val="22"/>
             </w:rPr>
           </w:pPr>
-          <w:hyperlink w:anchor="_Toc226474423" w:history="1">
+          <w:hyperlink w:anchor="_Toc227147740" w:history="1">
             <w:r>
               <w:rPr>
                 <w:rStyle w:val="Hiperhivatkozs"/>
@@ -3284,7 +3318,7 @@
               <w:rPr>
                 <w:noProof/>
               </w:rPr>
-              <w:instrText xml:space="preserve"> PAGEREF _Toc226474423 \h </w:instrText>
+              <w:instrText xml:space="preserve"> PAGEREF _Toc227147740 \h </w:instrText>
             </w:r>
             <w:r>
               <w:rPr>
@@ -3324,7 +3358,7 @@
               <w:szCs w:val="22"/>
             </w:rPr>
           </w:pPr>
-          <w:hyperlink w:anchor="_Toc226474424" w:history="1">
+          <w:hyperlink w:anchor="_Toc227147741" w:history="1">
             <w:r>
               <w:rPr>
                 <w:rStyle w:val="Hiperhivatkozs"/>
@@ -3348,7 +3382,7 @@
               <w:rPr>
                 <w:noProof/>
               </w:rPr>
-              <w:instrText xml:space="preserve"> PAGEREF _Toc226474424 \h </w:instrText>
+              <w:instrText xml:space="preserve"> PAGEREF _Toc227147741 \h </w:instrText>
             </w:r>
             <w:r>
               <w:rPr>
@@ -3388,7 +3422,7 @@
               <w:szCs w:val="22"/>
             </w:rPr>
           </w:pPr>
-          <w:hyperlink w:anchor="_Toc226474425" w:history="1">
+          <w:hyperlink w:anchor="_Toc227147742" w:history="1">
             <w:r>
               <w:rPr>
                 <w:rStyle w:val="Hiperhivatkozs"/>
@@ -3412,7 +3446,7 @@
               <w:rPr>
                 <w:noProof/>
               </w:rPr>
-              <w:instrText xml:space="preserve"> PAGEREF _Toc226474425 \h </w:instrText>
+              <w:instrText xml:space="preserve"> PAGEREF _Toc227147742 \h </w:instrText>
             </w:r>
             <w:r>
               <w:rPr>
@@ -3452,7 +3486,7 @@
               <w:szCs w:val="22"/>
             </w:rPr>
           </w:pPr>
-          <w:hyperlink w:anchor="_Toc226474426" w:history="1">
+          <w:hyperlink w:anchor="_Toc227147743" w:history="1">
             <w:r>
               <w:rPr>
                 <w:rStyle w:val="Hiperhivatkozs"/>
@@ -3476,7 +3510,7 @@
               <w:rPr>
                 <w:noProof/>
               </w:rPr>
-              <w:instrText xml:space="preserve"> PAGEREF _Toc226474426 \h </w:instrText>
+              <w:instrText xml:space="preserve"> PAGEREF _Toc227147743 \h </w:instrText>
             </w:r>
             <w:r>
               <w:rPr>
@@ -3516,7 +3550,7 @@
               <w:szCs w:val="22"/>
             </w:rPr>
           </w:pPr>
-          <w:hyperlink w:anchor="_Toc226474427" w:history="1">
+          <w:hyperlink w:anchor="_Toc227147744" w:history="1">
             <w:r>
               <w:rPr>
                 <w:rStyle w:val="Hiperhivatkozs"/>
@@ -3540,7 +3574,7 @@
               <w:rPr>
                 <w:noProof/>
               </w:rPr>
-              <w:instrText xml:space="preserve"> PAGEREF _Toc226474427 \h </w:instrText>
+              <w:instrText xml:space="preserve"> PAGEREF _Toc227147744 \h </w:instrText>
             </w:r>
             <w:r>
               <w:rPr>
@@ -3580,7 +3614,7 @@
               <w:szCs w:val="22"/>
             </w:rPr>
           </w:pPr>
-          <w:hyperlink w:anchor="_Toc226474428" w:history="1">
+          <w:hyperlink w:anchor="_Toc227147745" w:history="1">
             <w:r>
               <w:rPr>
                 <w:rStyle w:val="Hiperhivatkozs"/>
@@ -3604,7 +3638,7 @@
               <w:rPr>
                 <w:noProof/>
               </w:rPr>
-              <w:instrText xml:space="preserve"> PAGEREF _Toc226474428 \h </w:instrText>
+              <w:instrText xml:space="preserve"> PAGEREF _Toc227147745 \h </w:instrText>
             </w:r>
             <w:r>
               <w:rPr>
@@ -3644,7 +3678,7 @@
               <w:szCs w:val="22"/>
             </w:rPr>
           </w:pPr>
-          <w:hyperlink w:anchor="_Toc226474429" w:history="1">
+          <w:hyperlink w:anchor="_Toc227147746" w:history="1">
             <w:r>
               <w:rPr>
                 <w:rStyle w:val="Hiperhivatkozs"/>
@@ -3668,7 +3702,7 @@
               <w:rPr>
                 <w:noProof/>
               </w:rPr>
-              <w:instrText xml:space="preserve"> PAGEREF _Toc226474429 \h </w:instrText>
+              <w:instrText xml:space="preserve"> PAGEREF _Toc227147746 \h </w:instrText>
             </w:r>
             <w:r>
               <w:rPr>
@@ -3708,7 +3742,7 @@
               <w:szCs w:val="22"/>
             </w:rPr>
           </w:pPr>
-          <w:hyperlink w:anchor="_Toc226474430" w:history="1">
+          <w:hyperlink w:anchor="_Toc227147747" w:history="1">
             <w:r>
               <w:rPr>
                 <w:rStyle w:val="Hiperhivatkozs"/>
@@ -3732,7 +3766,7 @@
               <w:rPr>
                 <w:noProof/>
               </w:rPr>
-              <w:instrText xml:space="preserve"> PAGEREF _Toc226474430 \h </w:instrText>
+              <w:instrText xml:space="preserve"> PAGEREF _Toc227147747 \h </w:instrText>
             </w:r>
             <w:r>
               <w:rPr>
@@ -3772,7 +3806,7 @@
               <w:szCs w:val="22"/>
             </w:rPr>
           </w:pPr>
-          <w:hyperlink w:anchor="_Toc226474431" w:history="1">
+          <w:hyperlink w:anchor="_Toc227147748" w:history="1">
             <w:r>
               <w:rPr>
                 <w:rStyle w:val="Hiperhivatkozs"/>
@@ -3796,7 +3830,7 @@
               <w:rPr>
                 <w:noProof/>
               </w:rPr>
-              <w:instrText xml:space="preserve"> PAGEREF _Toc226474431 \h </w:instrText>
+              <w:instrText xml:space="preserve"> PAGEREF _Toc227147748 \h </w:instrText>
             </w:r>
             <w:r>
               <w:rPr>
@@ -3836,7 +3870,7 @@
               <w:szCs w:val="22"/>
             </w:rPr>
           </w:pPr>
-          <w:hyperlink w:anchor="_Toc226474432" w:history="1">
+          <w:hyperlink w:anchor="_Toc227147749" w:history="1">
             <w:r>
               <w:rPr>
                 <w:rStyle w:val="Hiperhivatkozs"/>
@@ -3860,7 +3894,7 @@
               <w:rPr>
                 <w:noProof/>
               </w:rPr>
-              <w:instrText xml:space="preserve"> PAGEREF _Toc226474432 \h </w:instrText>
+              <w:instrText xml:space="preserve"> PAGEREF _Toc227147749 \h </w:instrText>
             </w:r>
             <w:r>
               <w:rPr>
@@ -3900,7 +3934,7 @@
               <w:szCs w:val="22"/>
             </w:rPr>
           </w:pPr>
-          <w:hyperlink w:anchor="_Toc226474433" w:history="1">
+          <w:hyperlink w:anchor="_Toc227147750" w:history="1">
             <w:r>
               <w:rPr>
                 <w:rStyle w:val="Hiperhivatkozs"/>
@@ -3924,7 +3958,7 @@
               <w:rPr>
                 <w:noProof/>
               </w:rPr>
-              <w:instrText xml:space="preserve"> PAGEREF _Toc226474433 \h </w:instrText>
+              <w:instrText xml:space="preserve"> PAGEREF _Toc227147750 \h </w:instrText>
             </w:r>
             <w:r>
               <w:rPr>
@@ -3964,7 +3998,7 @@
               <w:szCs w:val="22"/>
             </w:rPr>
           </w:pPr>
-          <w:hyperlink w:anchor="_Toc226474434" w:history="1">
+          <w:hyperlink w:anchor="_Toc227147751" w:history="1">
             <w:r>
               <w:rPr>
                 <w:rStyle w:val="Hiperhivatkozs"/>
@@ -3988,7 +4022,7 @@
               <w:rPr>
                 <w:noProof/>
               </w:rPr>
-              <w:instrText xml:space="preserve"> PAGEREF _Toc226474434 \h </w:instrText>
+              <w:instrText xml:space="preserve"> PAGEREF _Toc227147751 \h </w:instrText>
             </w:r>
             <w:r>
               <w:rPr>
@@ -4028,7 +4062,7 @@
               <w:szCs w:val="22"/>
             </w:rPr>
           </w:pPr>
-          <w:hyperlink w:anchor="_Toc226474435" w:history="1">
+          <w:hyperlink w:anchor="_Toc227147752" w:history="1">
             <w:r>
               <w:rPr>
                 <w:rStyle w:val="Hiperhivatkozs"/>
@@ -4052,7 +4086,7 @@
               <w:rPr>
                 <w:noProof/>
               </w:rPr>
-              <w:instrText xml:space="preserve"> PAGEREF _Toc226474435 \h </w:instrText>
+              <w:instrText xml:space="preserve"> PAGEREF _Toc227147752 \h </w:instrText>
             </w:r>
             <w:r>
               <w:rPr>
@@ -4092,7 +4126,7 @@
               <w:szCs w:val="22"/>
             </w:rPr>
           </w:pPr>
-          <w:hyperlink w:anchor="_Toc226474436" w:history="1">
+          <w:hyperlink w:anchor="_Toc227147753" w:history="1">
             <w:r>
               <w:rPr>
                 <w:rStyle w:val="Hiperhivatkozs"/>
@@ -4116,7 +4150,7 @@
               <w:rPr>
                 <w:noProof/>
               </w:rPr>
-              <w:instrText xml:space="preserve"> PAGEREF _Toc226474436 \h </w:instrText>
+              <w:instrText xml:space="preserve"> PAGEREF _Toc227147753 \h </w:instrText>
             </w:r>
             <w:r>
               <w:rPr>
@@ -4156,7 +4190,7 @@
               <w:szCs w:val="22"/>
             </w:rPr>
           </w:pPr>
-          <w:hyperlink w:anchor="_Toc226474437" w:history="1">
+          <w:hyperlink w:anchor="_Toc227147754" w:history="1">
             <w:r>
               <w:rPr>
                 <w:rStyle w:val="Hiperhivatkozs"/>
@@ -4180,7 +4214,7 @@
               <w:rPr>
                 <w:noProof/>
               </w:rPr>
-              <w:instrText xml:space="preserve"> PAGEREF _Toc226474437 \h </w:instrText>
+              <w:instrText xml:space="preserve"> PAGEREF _Toc227147754 \h </w:instrText>
             </w:r>
             <w:r>
               <w:rPr>
@@ -4220,7 +4254,7 @@
               <w:szCs w:val="22"/>
             </w:rPr>
           </w:pPr>
-          <w:hyperlink w:anchor="_Toc226474438" w:history="1">
+          <w:hyperlink w:anchor="_Toc227147755" w:history="1">
             <w:r>
               <w:rPr>
                 <w:rStyle w:val="Hiperhivatkozs"/>
@@ -4244,7 +4278,7 @@
               <w:rPr>
                 <w:noProof/>
               </w:rPr>
-              <w:instrText xml:space="preserve"> PAGEREF _Toc226474438 \h </w:instrText>
+              <w:instrText xml:space="preserve"> PAGEREF _Toc227147755 \h </w:instrText>
             </w:r>
             <w:r>
               <w:rPr>
@@ -4284,7 +4318,7 @@
               <w:szCs w:val="22"/>
             </w:rPr>
           </w:pPr>
-          <w:hyperlink w:anchor="_Toc226474439" w:history="1">
+          <w:hyperlink w:anchor="_Toc227147756" w:history="1">
             <w:r>
               <w:rPr>
                 <w:rStyle w:val="Hiperhivatkozs"/>
@@ -4308,7 +4342,7 @@
               <w:rPr>
                 <w:noProof/>
               </w:rPr>
-              <w:instrText xml:space="preserve"> PAGEREF _Toc226474439 \h </w:instrText>
+              <w:instrText xml:space="preserve"> PAGEREF _Toc227147756 \h </w:instrText>
             </w:r>
             <w:r>
               <w:rPr>
@@ -4348,7 +4382,7 @@
               <w:szCs w:val="22"/>
             </w:rPr>
           </w:pPr>
-          <w:hyperlink w:anchor="_Toc226474440" w:history="1">
+          <w:hyperlink w:anchor="_Toc227147757" w:history="1">
             <w:r>
               <w:rPr>
                 <w:rStyle w:val="Hiperhivatkozs"/>
@@ -4372,7 +4406,7 @@
               <w:rPr>
                 <w:noProof/>
               </w:rPr>
-              <w:instrText xml:space="preserve"> PAGEREF _Toc226474440 \h </w:instrText>
+              <w:instrText xml:space="preserve"> PAGEREF _Toc227147757 \h </w:instrText>
             </w:r>
             <w:r>
               <w:rPr>
@@ -4412,7 +4446,7 @@
               <w:szCs w:val="22"/>
             </w:rPr>
           </w:pPr>
-          <w:hyperlink w:anchor="_Toc226474441" w:history="1">
+          <w:hyperlink w:anchor="_Toc227147758" w:history="1">
             <w:r>
               <w:rPr>
                 <w:rStyle w:val="Hiperhivatkozs"/>
@@ -4436,7 +4470,7 @@
               <w:rPr>
                 <w:noProof/>
               </w:rPr>
-              <w:instrText xml:space="preserve"> PAGEREF _Toc226474441 \h </w:instrText>
+              <w:instrText xml:space="preserve"> PAGEREF _Toc227147758 \h </w:instrText>
             </w:r>
             <w:r>
               <w:rPr>
@@ -4476,7 +4510,7 @@
               <w:szCs w:val="22"/>
             </w:rPr>
           </w:pPr>
-          <w:hyperlink w:anchor="_Toc226474442" w:history="1">
+          <w:hyperlink w:anchor="_Toc227147759" w:history="1">
             <w:r>
               <w:rPr>
                 <w:rStyle w:val="Hiperhivatkozs"/>
@@ -4500,7 +4534,7 @@
               <w:rPr>
                 <w:noProof/>
               </w:rPr>
-              <w:instrText xml:space="preserve"> PAGEREF _Toc226474442 \h </w:instrText>
+              <w:instrText xml:space="preserve"> PAGEREF _Toc227147759 \h </w:instrText>
             </w:r>
             <w:r>
               <w:rPr>
@@ -4517,7 +4551,7 @@
               <w:rPr>
                 <w:noProof/>
               </w:rPr>
-              <w:t>15</w:t>
+              <w:t>16</w:t>
             </w:r>
             <w:r>
               <w:rPr>
@@ -4540,7 +4574,7 @@
               <w:szCs w:val="22"/>
             </w:rPr>
           </w:pPr>
-          <w:hyperlink w:anchor="_Toc226474443" w:history="1">
+          <w:hyperlink w:anchor="_Toc227147760" w:history="1">
             <w:r>
               <w:rPr>
                 <w:rStyle w:val="Hiperhivatkozs"/>
@@ -4564,7 +4598,7 @@
               <w:rPr>
                 <w:noProof/>
               </w:rPr>
-              <w:instrText xml:space="preserve"> PAGEREF _Toc226474443 \h </w:instrText>
+              <w:instrText xml:space="preserve"> PAGEREF _Toc227147760 \h </w:instrText>
             </w:r>
             <w:r>
               <w:rPr>
@@ -4604,7 +4638,7 @@
               <w:szCs w:val="22"/>
             </w:rPr>
           </w:pPr>
-          <w:hyperlink w:anchor="_Toc226474444" w:history="1">
+          <w:hyperlink w:anchor="_Toc227147761" w:history="1">
             <w:r>
               <w:rPr>
                 <w:rStyle w:val="Hiperhivatkozs"/>
@@ -4628,7 +4662,7 @@
               <w:rPr>
                 <w:noProof/>
               </w:rPr>
-              <w:instrText xml:space="preserve"> PAGEREF _Toc226474444 \h </w:instrText>
+              <w:instrText xml:space="preserve"> PAGEREF _Toc227147761 \h </w:instrText>
             </w:r>
             <w:r>
               <w:rPr>
@@ -4668,7 +4702,7 @@
               <w:szCs w:val="22"/>
             </w:rPr>
           </w:pPr>
-          <w:hyperlink w:anchor="_Toc226474445" w:history="1">
+          <w:hyperlink w:anchor="_Toc227147762" w:history="1">
             <w:r>
               <w:rPr>
                 <w:rStyle w:val="Hiperhivatkozs"/>
@@ -4692,7 +4726,7 @@
               <w:rPr>
                 <w:noProof/>
               </w:rPr>
-              <w:instrText xml:space="preserve"> PAGEREF _Toc226474445 \h </w:instrText>
+              <w:instrText xml:space="preserve"> PAGEREF _Toc227147762 \h </w:instrText>
             </w:r>
             <w:r>
               <w:rPr>
@@ -4732,7 +4766,7 @@
               <w:szCs w:val="22"/>
             </w:rPr>
           </w:pPr>
-          <w:hyperlink w:anchor="_Toc226474446" w:history="1">
+          <w:hyperlink w:anchor="_Toc227147763" w:history="1">
             <w:r>
               <w:rPr>
                 <w:rStyle w:val="Hiperhivatkozs"/>
@@ -4756,7 +4790,7 @@
               <w:rPr>
                 <w:noProof/>
               </w:rPr>
-              <w:instrText xml:space="preserve"> PAGEREF _Toc226474446 \h </w:instrText>
+              <w:instrText xml:space="preserve"> PAGEREF _Toc227147763 \h </w:instrText>
             </w:r>
             <w:r>
               <w:rPr>
@@ -4773,7 +4807,7 @@
               <w:rPr>
                 <w:noProof/>
               </w:rPr>
-              <w:t>16</w:t>
+              <w:t>17</w:t>
             </w:r>
             <w:r>
               <w:rPr>
@@ -4796,7 +4830,7 @@
               <w:szCs w:val="22"/>
             </w:rPr>
           </w:pPr>
-          <w:hyperlink w:anchor="_Toc226474447" w:history="1">
+          <w:hyperlink w:anchor="_Toc227147764" w:history="1">
             <w:r>
               <w:rPr>
                 <w:rStyle w:val="Hiperhivatkozs"/>
@@ -4820,7 +4854,7 @@
               <w:rPr>
                 <w:noProof/>
               </w:rPr>
-              <w:instrText xml:space="preserve"> PAGEREF _Toc226474447 \h </w:instrText>
+              <w:instrText xml:space="preserve"> PAGEREF _Toc227147764 \h </w:instrText>
             </w:r>
             <w:r>
               <w:rPr>
@@ -4860,7 +4894,7 @@
               <w:szCs w:val="22"/>
             </w:rPr>
           </w:pPr>
-          <w:hyperlink w:anchor="_Toc226474448" w:history="1">
+          <w:hyperlink w:anchor="_Toc227147765" w:history="1">
             <w:r>
               <w:rPr>
                 <w:rStyle w:val="Hiperhivatkozs"/>
@@ -4884,7 +4918,7 @@
               <w:rPr>
                 <w:noProof/>
               </w:rPr>
-              <w:instrText xml:space="preserve"> PAGEREF _Toc226474448 \h </w:instrText>
+              <w:instrText xml:space="preserve"> PAGEREF _Toc227147765 \h </w:instrText>
             </w:r>
             <w:r>
               <w:rPr>
@@ -4924,7 +4958,7 @@
               <w:szCs w:val="22"/>
             </w:rPr>
           </w:pPr>
-          <w:hyperlink w:anchor="_Toc226474449" w:history="1">
+          <w:hyperlink w:anchor="_Toc227147766" w:history="1">
             <w:r>
               <w:rPr>
                 <w:rStyle w:val="Hiperhivatkozs"/>
@@ -4948,7 +4982,7 @@
               <w:rPr>
                 <w:noProof/>
               </w:rPr>
-              <w:instrText xml:space="preserve"> PAGEREF _Toc226474449 \h </w:instrText>
+              <w:instrText xml:space="preserve"> PAGEREF _Toc227147766 \h </w:instrText>
             </w:r>
             <w:r>
               <w:rPr>
@@ -4988,7 +5022,7 @@
               <w:szCs w:val="22"/>
             </w:rPr>
           </w:pPr>
-          <w:hyperlink w:anchor="_Toc226474450" w:history="1">
+          <w:hyperlink w:anchor="_Toc227147767" w:history="1">
             <w:r>
               <w:rPr>
                 <w:rStyle w:val="Hiperhivatkozs"/>
@@ -5012,7 +5046,7 @@
               <w:rPr>
                 <w:noProof/>
               </w:rPr>
-              <w:instrText xml:space="preserve"> PAGEREF _Toc226474450 \h </w:instrText>
+              <w:instrText xml:space="preserve"> PAGEREF _Toc227147767 \h </w:instrText>
             </w:r>
             <w:r>
               <w:rPr>
@@ -5029,7 +5063,7 @@
               <w:rPr>
                 <w:noProof/>
               </w:rPr>
-              <w:t>17</w:t>
+              <w:t>18</w:t>
             </w:r>
             <w:r>
               <w:rPr>
@@ -5052,7 +5086,7 @@
               <w:szCs w:val="22"/>
             </w:rPr>
           </w:pPr>
-          <w:hyperlink w:anchor="_Toc226474451" w:history="1">
+          <w:hyperlink w:anchor="_Toc227147768" w:history="1">
             <w:r>
               <w:rPr>
                 <w:rStyle w:val="Hiperhivatkozs"/>
@@ -5076,7 +5110,7 @@
               <w:rPr>
                 <w:noProof/>
               </w:rPr>
-              <w:instrText xml:space="preserve"> PAGEREF _Toc226474451 \h </w:instrText>
+              <w:instrText xml:space="preserve"> PAGEREF _Toc227147768 \h </w:instrText>
             </w:r>
             <w:r>
               <w:rPr>
@@ -5116,7 +5150,7 @@
               <w:szCs w:val="22"/>
             </w:rPr>
           </w:pPr>
-          <w:hyperlink w:anchor="_Toc226474452" w:history="1">
+          <w:hyperlink w:anchor="_Toc227147769" w:history="1">
             <w:r>
               <w:rPr>
                 <w:rStyle w:val="Hiperhivatkozs"/>
@@ -5140,7 +5174,7 @@
               <w:rPr>
                 <w:noProof/>
               </w:rPr>
-              <w:instrText xml:space="preserve"> PAGEREF _Toc226474452 \h </w:instrText>
+              <w:instrText xml:space="preserve"> PAGEREF _Toc227147769 \h </w:instrText>
             </w:r>
             <w:r>
               <w:rPr>
@@ -5180,7 +5214,7 @@
               <w:szCs w:val="22"/>
             </w:rPr>
           </w:pPr>
-          <w:hyperlink w:anchor="_Toc226474453" w:history="1">
+          <w:hyperlink w:anchor="_Toc227147770" w:history="1">
             <w:r>
               <w:rPr>
                 <w:rStyle w:val="Hiperhivatkozs"/>
@@ -5204,7 +5238,7 @@
               <w:rPr>
                 <w:noProof/>
               </w:rPr>
-              <w:instrText xml:space="preserve"> PAGEREF _Toc226474453 \h </w:instrText>
+              <w:instrText xml:space="preserve"> PAGEREF _Toc227147770 \h </w:instrText>
             </w:r>
             <w:r>
               <w:rPr>
@@ -5244,7 +5278,7 @@
               <w:szCs w:val="22"/>
             </w:rPr>
           </w:pPr>
-          <w:hyperlink w:anchor="_Toc226474454" w:history="1">
+          <w:hyperlink w:anchor="_Toc227147771" w:history="1">
             <w:r>
               <w:rPr>
                 <w:rStyle w:val="Hiperhivatkozs"/>
@@ -5268,7 +5302,7 @@
               <w:rPr>
                 <w:noProof/>
               </w:rPr>
-              <w:instrText xml:space="preserve"> PAGEREF _Toc226474454 \h </w:instrText>
+              <w:instrText xml:space="preserve"> PAGEREF _Toc227147771 \h </w:instrText>
             </w:r>
             <w:r>
               <w:rPr>
@@ -5308,7 +5342,7 @@
               <w:szCs w:val="22"/>
             </w:rPr>
           </w:pPr>
-          <w:hyperlink w:anchor="_Toc226474455" w:history="1">
+          <w:hyperlink w:anchor="_Toc227147772" w:history="1">
             <w:r>
               <w:rPr>
                 <w:rStyle w:val="Hiperhivatkozs"/>
@@ -5332,7 +5366,7 @@
               <w:rPr>
                 <w:noProof/>
               </w:rPr>
-              <w:instrText xml:space="preserve"> PAGEREF _Toc226474455 \h </w:instrText>
+              <w:instrText xml:space="preserve"> PAGEREF _Toc227147772 \h </w:instrText>
             </w:r>
             <w:r>
               <w:rPr>
@@ -5372,7 +5406,7 @@
               <w:szCs w:val="22"/>
             </w:rPr>
           </w:pPr>
-          <w:hyperlink w:anchor="_Toc226474456" w:history="1">
+          <w:hyperlink w:anchor="_Toc227147773" w:history="1">
             <w:r>
               <w:rPr>
                 <w:rStyle w:val="Hiperhivatkozs"/>
@@ -5396,7 +5430,7 @@
               <w:rPr>
                 <w:noProof/>
               </w:rPr>
-              <w:instrText xml:space="preserve"> PAGEREF _Toc226474456 \h </w:instrText>
+              <w:instrText xml:space="preserve"> PAGEREF _Toc227147773 \h </w:instrText>
             </w:r>
             <w:r>
               <w:rPr>
@@ -5436,7 +5470,7 @@
               <w:szCs w:val="22"/>
             </w:rPr>
           </w:pPr>
-          <w:hyperlink w:anchor="_Toc226474457" w:history="1">
+          <w:hyperlink w:anchor="_Toc227147774" w:history="1">
             <w:r>
               <w:rPr>
                 <w:rStyle w:val="Hiperhivatkozs"/>
@@ -5460,7 +5494,7 @@
               <w:rPr>
                 <w:noProof/>
               </w:rPr>
-              <w:instrText xml:space="preserve"> PAGEREF _Toc226474457 \h </w:instrText>
+              <w:instrText xml:space="preserve"> PAGEREF _Toc227147774 \h </w:instrText>
             </w:r>
             <w:r>
               <w:rPr>
@@ -5477,7 +5511,7 @@
               <w:rPr>
                 <w:noProof/>
               </w:rPr>
-              <w:t>19</w:t>
+              <w:t>20</w:t>
             </w:r>
             <w:r>
               <w:rPr>
@@ -5500,7 +5534,7 @@
               <w:szCs w:val="22"/>
             </w:rPr>
           </w:pPr>
-          <w:hyperlink w:anchor="_Toc226474458" w:history="1">
+          <w:hyperlink w:anchor="_Toc227147775" w:history="1">
             <w:r>
               <w:rPr>
                 <w:rStyle w:val="Hiperhivatkozs"/>
@@ -5524,7 +5558,7 @@
               <w:rPr>
                 <w:noProof/>
               </w:rPr>
-              <w:instrText xml:space="preserve"> PAGEREF _Toc226474458 \h </w:instrText>
+              <w:instrText xml:space="preserve"> PAGEREF _Toc227147775 \h </w:instrText>
             </w:r>
             <w:r>
               <w:rPr>
@@ -5564,7 +5598,7 @@
               <w:szCs w:val="22"/>
             </w:rPr>
           </w:pPr>
-          <w:hyperlink w:anchor="_Toc226474459" w:history="1">
+          <w:hyperlink w:anchor="_Toc227147776" w:history="1">
             <w:r>
               <w:rPr>
                 <w:rStyle w:val="Hiperhivatkozs"/>
@@ -5588,7 +5622,7 @@
               <w:rPr>
                 <w:noProof/>
               </w:rPr>
-              <w:instrText xml:space="preserve"> PAGEREF _Toc226474459 \h </w:instrText>
+              <w:instrText xml:space="preserve"> PAGEREF _Toc227147776 \h </w:instrText>
             </w:r>
             <w:r>
               <w:rPr>
@@ -5628,7 +5662,7 @@
               <w:szCs w:val="22"/>
             </w:rPr>
           </w:pPr>
-          <w:hyperlink w:anchor="_Toc226474460" w:history="1">
+          <w:hyperlink w:anchor="_Toc227147777" w:history="1">
             <w:r>
               <w:rPr>
                 <w:rStyle w:val="Hiperhivatkozs"/>
@@ -5652,7 +5686,7 @@
               <w:rPr>
                 <w:noProof/>
               </w:rPr>
-              <w:instrText xml:space="preserve"> PAGEREF _Toc226474460 \h </w:instrText>
+              <w:instrText xml:space="preserve"> PAGEREF _Toc227147777 \h </w:instrText>
             </w:r>
             <w:r>
               <w:rPr>
@@ -5692,7 +5726,7 @@
               <w:szCs w:val="22"/>
             </w:rPr>
           </w:pPr>
-          <w:hyperlink w:anchor="_Toc226474461" w:history="1">
+          <w:hyperlink w:anchor="_Toc227147778" w:history="1">
             <w:r>
               <w:rPr>
                 <w:rStyle w:val="Hiperhivatkozs"/>
@@ -5716,7 +5750,7 @@
               <w:rPr>
                 <w:noProof/>
               </w:rPr>
-              <w:instrText xml:space="preserve"> PAGEREF _Toc226474461 \h </w:instrText>
+              <w:instrText xml:space="preserve"> PAGEREF _Toc227147778 \h </w:instrText>
             </w:r>
             <w:r>
               <w:rPr>
@@ -5756,7 +5790,7 @@
               <w:szCs w:val="22"/>
             </w:rPr>
           </w:pPr>
-          <w:hyperlink w:anchor="_Toc226474462" w:history="1">
+          <w:hyperlink w:anchor="_Toc227147779" w:history="1">
             <w:r>
               <w:rPr>
                 <w:rStyle w:val="Hiperhivatkozs"/>
@@ -5780,7 +5814,7 @@
               <w:rPr>
                 <w:noProof/>
               </w:rPr>
-              <w:instrText xml:space="preserve"> PAGEREF _Toc226474462 \h </w:instrText>
+              <w:instrText xml:space="preserve"> PAGEREF _Toc227147779 \h </w:instrText>
             </w:r>
             <w:r>
               <w:rPr>
@@ -5820,7 +5854,7 @@
               <w:szCs w:val="22"/>
             </w:rPr>
           </w:pPr>
-          <w:hyperlink w:anchor="_Toc226474463" w:history="1">
+          <w:hyperlink w:anchor="_Toc227147780" w:history="1">
             <w:r>
               <w:rPr>
                 <w:rStyle w:val="Hiperhivatkozs"/>
@@ -5844,7 +5878,7 @@
               <w:rPr>
                 <w:noProof/>
               </w:rPr>
-              <w:instrText xml:space="preserve"> PAGEREF _Toc226474463 \h </w:instrText>
+              <w:instrText xml:space="preserve"> PAGEREF _Toc227147780 \h </w:instrText>
             </w:r>
             <w:r>
               <w:rPr>
@@ -5884,7 +5918,7 @@
               <w:szCs w:val="22"/>
             </w:rPr>
           </w:pPr>
-          <w:hyperlink w:anchor="_Toc226474464" w:history="1">
+          <w:hyperlink w:anchor="_Toc227147781" w:history="1">
             <w:r>
               <w:rPr>
                 <w:rStyle w:val="Hiperhivatkozs"/>
@@ -5908,7 +5942,7 @@
               <w:rPr>
                 <w:noProof/>
               </w:rPr>
-              <w:instrText xml:space="preserve"> PAGEREF _Toc226474464 \h </w:instrText>
+              <w:instrText xml:space="preserve"> PAGEREF _Toc227147781 \h </w:instrText>
             </w:r>
             <w:r>
               <w:rPr>
@@ -5948,7 +5982,7 @@
               <w:szCs w:val="22"/>
             </w:rPr>
           </w:pPr>
-          <w:hyperlink w:anchor="_Toc226474465" w:history="1">
+          <w:hyperlink w:anchor="_Toc227147782" w:history="1">
             <w:r>
               <w:rPr>
                 <w:rStyle w:val="Hiperhivatkozs"/>
@@ -5972,7 +6006,7 @@
               <w:rPr>
                 <w:noProof/>
               </w:rPr>
-              <w:instrText xml:space="preserve"> PAGEREF _Toc226474465 \h </w:instrText>
+              <w:instrText xml:space="preserve"> PAGEREF _Toc227147782 \h </w:instrText>
             </w:r>
             <w:r>
               <w:rPr>
@@ -6012,7 +6046,7 @@
               <w:szCs w:val="22"/>
             </w:rPr>
           </w:pPr>
-          <w:hyperlink w:anchor="_Toc226474466" w:history="1">
+          <w:hyperlink w:anchor="_Toc227147783" w:history="1">
             <w:r>
               <w:rPr>
                 <w:rStyle w:val="Hiperhivatkozs"/>
@@ -6036,7 +6070,7 @@
               <w:rPr>
                 <w:noProof/>
               </w:rPr>
-              <w:instrText xml:space="preserve"> PAGEREF _Toc226474466 \h </w:instrText>
+              <w:instrText xml:space="preserve"> PAGEREF _Toc227147783 \h </w:instrText>
             </w:r>
             <w:r>
               <w:rPr>
@@ -6076,7 +6110,7 @@
               <w:szCs w:val="22"/>
             </w:rPr>
           </w:pPr>
-          <w:hyperlink w:anchor="_Toc226474467" w:history="1">
+          <w:hyperlink w:anchor="_Toc227147784" w:history="1">
             <w:r>
               <w:rPr>
                 <w:rStyle w:val="Hiperhivatkozs"/>
@@ -6100,7 +6134,7 @@
               <w:rPr>
                 <w:noProof/>
               </w:rPr>
-              <w:instrText xml:space="preserve"> PAGEREF _Toc226474467 \h </w:instrText>
+              <w:instrText xml:space="preserve"> PAGEREF _Toc227147784 \h </w:instrText>
             </w:r>
             <w:r>
               <w:rPr>
@@ -6140,7 +6174,7 @@
               <w:szCs w:val="22"/>
             </w:rPr>
           </w:pPr>
-          <w:hyperlink w:anchor="_Toc226474468" w:history="1">
+          <w:hyperlink w:anchor="_Toc227147785" w:history="1">
             <w:r>
               <w:rPr>
                 <w:rStyle w:val="Hiperhivatkozs"/>
@@ -6164,7 +6198,7 @@
               <w:rPr>
                 <w:noProof/>
               </w:rPr>
-              <w:instrText xml:space="preserve"> PAGEREF _Toc226474468 \h </w:instrText>
+              <w:instrText xml:space="preserve"> PAGEREF _Toc227147785 \h </w:instrText>
             </w:r>
             <w:r>
               <w:rPr>
@@ -6204,7 +6238,7 @@
               <w:szCs w:val="22"/>
             </w:rPr>
           </w:pPr>
-          <w:hyperlink w:anchor="_Toc226474469" w:history="1">
+          <w:hyperlink w:anchor="_Toc227147786" w:history="1">
             <w:r>
               <w:rPr>
                 <w:rStyle w:val="Hiperhivatkozs"/>
@@ -6228,7 +6262,7 @@
               <w:rPr>
                 <w:noProof/>
               </w:rPr>
-              <w:instrText xml:space="preserve"> PAGEREF _Toc226474469 \h </w:instrText>
+              <w:instrText xml:space="preserve"> PAGEREF _Toc227147786 \h </w:instrText>
             </w:r>
             <w:r>
               <w:rPr>
@@ -6268,7 +6302,7 @@
               <w:szCs w:val="22"/>
             </w:rPr>
           </w:pPr>
-          <w:hyperlink w:anchor="_Toc226474470" w:history="1">
+          <w:hyperlink w:anchor="_Toc227147787" w:history="1">
             <w:r>
               <w:rPr>
                 <w:rStyle w:val="Hiperhivatkozs"/>
@@ -6292,7 +6326,7 @@
               <w:rPr>
                 <w:noProof/>
               </w:rPr>
-              <w:instrText xml:space="preserve"> PAGEREF _Toc226474470 \h </w:instrText>
+              <w:instrText xml:space="preserve"> PAGEREF _Toc227147787 \h </w:instrText>
             </w:r>
             <w:r>
               <w:rPr>
@@ -6332,7 +6366,7 @@
               <w:szCs w:val="22"/>
             </w:rPr>
           </w:pPr>
-          <w:hyperlink w:anchor="_Toc226474471" w:history="1">
+          <w:hyperlink w:anchor="_Toc227147788" w:history="1">
             <w:r>
               <w:rPr>
                 <w:rStyle w:val="Hiperhivatkozs"/>
@@ -6356,7 +6390,7 @@
               <w:rPr>
                 <w:noProof/>
               </w:rPr>
-              <w:instrText xml:space="preserve"> PAGEREF _Toc226474471 \h </w:instrText>
+              <w:instrText xml:space="preserve"> PAGEREF _Toc227147788 \h </w:instrText>
             </w:r>
             <w:r>
               <w:rPr>
@@ -6396,7 +6430,7 @@
               <w:szCs w:val="22"/>
             </w:rPr>
           </w:pPr>
-          <w:hyperlink w:anchor="_Toc226474472" w:history="1">
+          <w:hyperlink w:anchor="_Toc227147789" w:history="1">
             <w:r>
               <w:rPr>
                 <w:rStyle w:val="Hiperhivatkozs"/>
@@ -6420,7 +6454,7 @@
               <w:rPr>
                 <w:noProof/>
               </w:rPr>
-              <w:instrText xml:space="preserve"> PAGEREF _Toc226474472 \h </w:instrText>
+              <w:instrText xml:space="preserve"> PAGEREF _Toc227147789 \h </w:instrText>
             </w:r>
             <w:r>
               <w:rPr>
@@ -6460,7 +6494,7 @@
               <w:szCs w:val="22"/>
             </w:rPr>
           </w:pPr>
-          <w:hyperlink w:anchor="_Toc226474473" w:history="1">
+          <w:hyperlink w:anchor="_Toc227147790" w:history="1">
             <w:r>
               <w:rPr>
                 <w:rStyle w:val="Hiperhivatkozs"/>
@@ -6484,7 +6518,7 @@
               <w:rPr>
                 <w:noProof/>
               </w:rPr>
-              <w:instrText xml:space="preserve"> PAGEREF _Toc226474473 \h </w:instrText>
+              <w:instrText xml:space="preserve"> PAGEREF _Toc227147790 \h </w:instrText>
             </w:r>
             <w:r>
               <w:rPr>
@@ -6524,7 +6558,7 @@
               <w:szCs w:val="22"/>
             </w:rPr>
           </w:pPr>
-          <w:hyperlink w:anchor="_Toc226474474" w:history="1">
+          <w:hyperlink w:anchor="_Toc227147791" w:history="1">
             <w:r>
               <w:rPr>
                 <w:rStyle w:val="Hiperhivatkozs"/>
@@ -6548,7 +6582,7 @@
               <w:rPr>
                 <w:noProof/>
               </w:rPr>
-              <w:instrText xml:space="preserve"> PAGEREF _Toc226474474 \h </w:instrText>
+              <w:instrText xml:space="preserve"> PAGEREF _Toc227147791 \h </w:instrText>
             </w:r>
             <w:r>
               <w:rPr>
@@ -6565,7 +6599,7 @@
               <w:rPr>
                 <w:noProof/>
               </w:rPr>
-              <w:t>24</w:t>
+              <w:t>25</w:t>
             </w:r>
             <w:r>
               <w:rPr>
@@ -6588,7 +6622,7 @@
               <w:szCs w:val="22"/>
             </w:rPr>
           </w:pPr>
-          <w:hyperlink w:anchor="_Toc226474475" w:history="1">
+          <w:hyperlink w:anchor="_Toc227147792" w:history="1">
             <w:r>
               <w:rPr>
                 <w:rStyle w:val="Hiperhivatkozs"/>
@@ -6612,7 +6646,7 @@
               <w:rPr>
                 <w:noProof/>
               </w:rPr>
-              <w:instrText xml:space="preserve"> PAGEREF _Toc226474475 \h </w:instrText>
+              <w:instrText xml:space="preserve"> PAGEREF _Toc227147792 \h </w:instrText>
             </w:r>
             <w:r>
               <w:rPr>
@@ -6652,7 +6686,7 @@
               <w:szCs w:val="22"/>
             </w:rPr>
           </w:pPr>
-          <w:hyperlink w:anchor="_Toc226474476" w:history="1">
+          <w:hyperlink w:anchor="_Toc227147793" w:history="1">
             <w:r>
               <w:rPr>
                 <w:rStyle w:val="Hiperhivatkozs"/>
@@ -6676,7 +6710,7 @@
               <w:rPr>
                 <w:noProof/>
               </w:rPr>
-              <w:instrText xml:space="preserve"> PAGEREF _Toc226474476 \h </w:instrText>
+              <w:instrText xml:space="preserve"> PAGEREF _Toc227147793 \h </w:instrText>
             </w:r>
             <w:r>
               <w:rPr>
@@ -6716,7 +6750,7 @@
               <w:szCs w:val="22"/>
             </w:rPr>
           </w:pPr>
-          <w:hyperlink w:anchor="_Toc226474477" w:history="1">
+          <w:hyperlink w:anchor="_Toc227147794" w:history="1">
             <w:r>
               <w:rPr>
                 <w:rStyle w:val="Hiperhivatkozs"/>
@@ -6740,7 +6774,7 @@
               <w:rPr>
                 <w:noProof/>
               </w:rPr>
-              <w:instrText xml:space="preserve"> PAGEREF _Toc226474477 \h </w:instrText>
+              <w:instrText xml:space="preserve"> PAGEREF _Toc227147794 \h </w:instrText>
             </w:r>
             <w:r>
               <w:rPr>
@@ -6780,7 +6814,7 @@
               <w:szCs w:val="22"/>
             </w:rPr>
           </w:pPr>
-          <w:hyperlink w:anchor="_Toc226474478" w:history="1">
+          <w:hyperlink w:anchor="_Toc227147795" w:history="1">
             <w:r>
               <w:rPr>
                 <w:rStyle w:val="Hiperhivatkozs"/>
@@ -6804,7 +6838,7 @@
               <w:rPr>
                 <w:noProof/>
               </w:rPr>
-              <w:instrText xml:space="preserve"> PAGEREF _Toc226474478 \h </w:instrText>
+              <w:instrText xml:space="preserve"> PAGEREF _Toc227147795 \h </w:instrText>
             </w:r>
             <w:r>
               <w:rPr>
@@ -6821,7 +6855,7 @@
               <w:rPr>
                 <w:noProof/>
               </w:rPr>
-              <w:t>25</w:t>
+              <w:t>26</w:t>
             </w:r>
             <w:r>
               <w:rPr>
@@ -6844,7 +6878,7 @@
               <w:szCs w:val="22"/>
             </w:rPr>
           </w:pPr>
-          <w:hyperlink w:anchor="_Toc226474479" w:history="1">
+          <w:hyperlink w:anchor="_Toc227147796" w:history="1">
             <w:r>
               <w:rPr>
                 <w:rStyle w:val="Hiperhivatkozs"/>
@@ -6868,7 +6902,7 @@
               <w:rPr>
                 <w:noProof/>
               </w:rPr>
-              <w:instrText xml:space="preserve"> PAGEREF _Toc226474479 \h </w:instrText>
+              <w:instrText xml:space="preserve"> PAGEREF _Toc227147796 \h </w:instrText>
             </w:r>
             <w:r>
               <w:rPr>
@@ -6908,7 +6942,7 @@
               <w:szCs w:val="22"/>
             </w:rPr>
           </w:pPr>
-          <w:hyperlink w:anchor="_Toc226474480" w:history="1">
+          <w:hyperlink w:anchor="_Toc227147797" w:history="1">
             <w:r>
               <w:rPr>
                 <w:rStyle w:val="Hiperhivatkozs"/>
@@ -6932,7 +6966,7 @@
               <w:rPr>
                 <w:noProof/>
               </w:rPr>
-              <w:instrText xml:space="preserve"> PAGEREF _Toc226474480 \h </w:instrText>
+              <w:instrText xml:space="preserve"> PAGEREF _Toc227147797 \h </w:instrText>
             </w:r>
             <w:r>
               <w:rPr>
@@ -6972,7 +7006,7 @@
               <w:szCs w:val="22"/>
             </w:rPr>
           </w:pPr>
-          <w:hyperlink w:anchor="_Toc226474481" w:history="1">
+          <w:hyperlink w:anchor="_Toc227147798" w:history="1">
             <w:r>
               <w:rPr>
                 <w:rStyle w:val="Hiperhivatkozs"/>
@@ -6996,7 +7030,7 @@
               <w:rPr>
                 <w:noProof/>
               </w:rPr>
-              <w:instrText xml:space="preserve"> PAGEREF _Toc226474481 \h </w:instrText>
+              <w:instrText xml:space="preserve"> PAGEREF _Toc227147798 \h </w:instrText>
             </w:r>
             <w:r>
               <w:rPr>
@@ -7036,7 +7070,7 @@
               <w:szCs w:val="22"/>
             </w:rPr>
           </w:pPr>
-          <w:hyperlink w:anchor="_Toc226474482" w:history="1">
+          <w:hyperlink w:anchor="_Toc227147799" w:history="1">
             <w:r>
               <w:rPr>
                 <w:rStyle w:val="Hiperhivatkozs"/>
@@ -7060,7 +7094,7 @@
               <w:rPr>
                 <w:noProof/>
               </w:rPr>
-              <w:instrText xml:space="preserve"> PAGEREF _Toc226474482 \h </w:instrText>
+              <w:instrText xml:space="preserve"> PAGEREF _Toc227147799 \h </w:instrText>
             </w:r>
             <w:r>
               <w:rPr>
@@ -7100,7 +7134,7 @@
               <w:szCs w:val="22"/>
             </w:rPr>
           </w:pPr>
-          <w:hyperlink w:anchor="_Toc226474483" w:history="1">
+          <w:hyperlink w:anchor="_Toc227147800" w:history="1">
             <w:r>
               <w:rPr>
                 <w:rStyle w:val="Hiperhivatkozs"/>
@@ -7124,7 +7158,7 @@
               <w:rPr>
                 <w:noProof/>
               </w:rPr>
-              <w:instrText xml:space="preserve"> PAGEREF _Toc226474483 \h </w:instrText>
+              <w:instrText xml:space="preserve"> PAGEREF _Toc227147800 \h </w:instrText>
             </w:r>
             <w:r>
               <w:rPr>
@@ -7164,7 +7198,7 @@
               <w:szCs w:val="22"/>
             </w:rPr>
           </w:pPr>
-          <w:hyperlink w:anchor="_Toc226474484" w:history="1">
+          <w:hyperlink w:anchor="_Toc227147801" w:history="1">
             <w:r>
               <w:rPr>
                 <w:rStyle w:val="Hiperhivatkozs"/>
@@ -7188,7 +7222,7 @@
               <w:rPr>
                 <w:noProof/>
               </w:rPr>
-              <w:instrText xml:space="preserve"> PAGEREF _Toc226474484 \h </w:instrText>
+              <w:instrText xml:space="preserve"> PAGEREF _Toc227147801 \h </w:instrText>
             </w:r>
             <w:r>
               <w:rPr>
@@ -7228,7 +7262,7 @@
               <w:szCs w:val="22"/>
             </w:rPr>
           </w:pPr>
-          <w:hyperlink w:anchor="_Toc226474485" w:history="1">
+          <w:hyperlink w:anchor="_Toc227147802" w:history="1">
             <w:r>
               <w:rPr>
                 <w:rStyle w:val="Hiperhivatkozs"/>
@@ -7252,7 +7286,7 @@
               <w:rPr>
                 <w:noProof/>
               </w:rPr>
-              <w:instrText xml:space="preserve"> PAGEREF _Toc226474485 \h </w:instrText>
+              <w:instrText xml:space="preserve"> PAGEREF _Toc227147802 \h </w:instrText>
             </w:r>
             <w:r>
               <w:rPr>
@@ -7292,7 +7326,7 @@
               <w:szCs w:val="22"/>
             </w:rPr>
           </w:pPr>
-          <w:hyperlink w:anchor="_Toc226474486" w:history="1">
+          <w:hyperlink w:anchor="_Toc227147803" w:history="1">
             <w:r>
               <w:rPr>
                 <w:rStyle w:val="Hiperhivatkozs"/>
@@ -7316,7 +7350,7 @@
               <w:rPr>
                 <w:noProof/>
               </w:rPr>
-              <w:instrText xml:space="preserve"> PAGEREF _Toc226474486 \h </w:instrText>
+              <w:instrText xml:space="preserve"> PAGEREF _Toc227147803 \h </w:instrText>
             </w:r>
             <w:r>
               <w:rPr>
@@ -7356,7 +7390,7 @@
               <w:szCs w:val="22"/>
             </w:rPr>
           </w:pPr>
-          <w:hyperlink w:anchor="_Toc226474487" w:history="1">
+          <w:hyperlink w:anchor="_Toc227147804" w:history="1">
             <w:r>
               <w:rPr>
                 <w:rStyle w:val="Hiperhivatkozs"/>
@@ -7380,7 +7414,7 @@
               <w:rPr>
                 <w:noProof/>
               </w:rPr>
-              <w:instrText xml:space="preserve"> PAGEREF _Toc226474487 \h </w:instrText>
+              <w:instrText xml:space="preserve"> PAGEREF _Toc227147804 \h </w:instrText>
             </w:r>
             <w:r>
               <w:rPr>
@@ -7420,7 +7454,7 @@
               <w:szCs w:val="22"/>
             </w:rPr>
           </w:pPr>
-          <w:hyperlink w:anchor="_Toc226474488" w:history="1">
+          <w:hyperlink w:anchor="_Toc227147805" w:history="1">
             <w:r>
               <w:rPr>
                 <w:rStyle w:val="Hiperhivatkozs"/>
@@ -7444,7 +7478,7 @@
               <w:rPr>
                 <w:noProof/>
               </w:rPr>
-              <w:instrText xml:space="preserve"> PAGEREF _Toc226474488 \h </w:instrText>
+              <w:instrText xml:space="preserve"> PAGEREF _Toc227147805 \h </w:instrText>
             </w:r>
             <w:r>
               <w:rPr>
@@ -7484,7 +7518,7 @@
               <w:szCs w:val="22"/>
             </w:rPr>
           </w:pPr>
-          <w:hyperlink w:anchor="_Toc226474489" w:history="1">
+          <w:hyperlink w:anchor="_Toc227147806" w:history="1">
             <w:r>
               <w:rPr>
                 <w:rStyle w:val="Hiperhivatkozs"/>
@@ -7508,7 +7542,7 @@
               <w:rPr>
                 <w:noProof/>
               </w:rPr>
-              <w:instrText xml:space="preserve"> PAGEREF _Toc226474489 \h </w:instrText>
+              <w:instrText xml:space="preserve"> PAGEREF _Toc227147806 \h </w:instrText>
             </w:r>
             <w:r>
               <w:rPr>
@@ -7548,7 +7582,7 @@
               <w:szCs w:val="22"/>
             </w:rPr>
           </w:pPr>
-          <w:hyperlink w:anchor="_Toc226474490" w:history="1">
+          <w:hyperlink w:anchor="_Toc227147807" w:history="1">
             <w:r>
               <w:rPr>
                 <w:rStyle w:val="Hiperhivatkozs"/>
@@ -7572,7 +7606,7 @@
               <w:rPr>
                 <w:noProof/>
               </w:rPr>
-              <w:instrText xml:space="preserve"> PAGEREF _Toc226474490 \h </w:instrText>
+              <w:instrText xml:space="preserve"> PAGEREF _Toc227147807 \h </w:instrText>
             </w:r>
             <w:r>
               <w:rPr>
@@ -7612,7 +7646,7 @@
               <w:szCs w:val="22"/>
             </w:rPr>
           </w:pPr>
-          <w:hyperlink w:anchor="_Toc226474491" w:history="1">
+          <w:hyperlink w:anchor="_Toc227147808" w:history="1">
             <w:r>
               <w:rPr>
                 <w:rStyle w:val="Hiperhivatkozs"/>
@@ -7636,7 +7670,7 @@
               <w:rPr>
                 <w:noProof/>
               </w:rPr>
-              <w:instrText xml:space="preserve"> PAGEREF _Toc226474491 \h </w:instrText>
+              <w:instrText xml:space="preserve"> PAGEREF _Toc227147808 \h </w:instrText>
             </w:r>
             <w:r>
               <w:rPr>
@@ -7653,7 +7687,7 @@
               <w:rPr>
                 <w:noProof/>
               </w:rPr>
-              <w:t>28</w:t>
+              <w:t>29</w:t>
             </w:r>
             <w:r>
               <w:rPr>
@@ -7676,7 +7710,7 @@
               <w:szCs w:val="22"/>
             </w:rPr>
           </w:pPr>
-          <w:hyperlink w:anchor="_Toc226474492" w:history="1">
+          <w:hyperlink w:anchor="_Toc227147809" w:history="1">
             <w:r>
               <w:rPr>
                 <w:rStyle w:val="Hiperhivatkozs"/>
@@ -7700,7 +7734,7 @@
               <w:rPr>
                 <w:noProof/>
               </w:rPr>
-              <w:instrText xml:space="preserve"> PAGEREF _Toc226474492 \h </w:instrText>
+              <w:instrText xml:space="preserve"> PAGEREF _Toc227147809 \h </w:instrText>
             </w:r>
             <w:r>
               <w:rPr>
@@ -7740,7 +7774,7 @@
               <w:szCs w:val="22"/>
             </w:rPr>
           </w:pPr>
-          <w:hyperlink w:anchor="_Toc226474493" w:history="1">
+          <w:hyperlink w:anchor="_Toc227147810" w:history="1">
             <w:r>
               <w:rPr>
                 <w:rStyle w:val="Hiperhivatkozs"/>
@@ -7764,7 +7798,7 @@
               <w:rPr>
                 <w:noProof/>
               </w:rPr>
-              <w:instrText xml:space="preserve"> PAGEREF _Toc226474493 \h </w:instrText>
+              <w:instrText xml:space="preserve"> PAGEREF _Toc227147810 \h </w:instrText>
             </w:r>
             <w:r>
               <w:rPr>
@@ -7804,7 +7838,7 @@
               <w:szCs w:val="22"/>
             </w:rPr>
           </w:pPr>
-          <w:hyperlink w:anchor="_Toc226474494" w:history="1">
+          <w:hyperlink w:anchor="_Toc227147811" w:history="1">
             <w:r>
               <w:rPr>
                 <w:rStyle w:val="Hiperhivatkozs"/>
@@ -7828,7 +7862,7 @@
               <w:rPr>
                 <w:noProof/>
               </w:rPr>
-              <w:instrText xml:space="preserve"> PAGEREF _Toc226474494 \h </w:instrText>
+              <w:instrText xml:space="preserve"> PAGEREF _Toc227147811 \h </w:instrText>
             </w:r>
             <w:r>
               <w:rPr>
@@ -7868,7 +7902,7 @@
               <w:szCs w:val="22"/>
             </w:rPr>
           </w:pPr>
-          <w:hyperlink w:anchor="_Toc226474495" w:history="1">
+          <w:hyperlink w:anchor="_Toc227147812" w:history="1">
             <w:r>
               <w:rPr>
                 <w:rStyle w:val="Hiperhivatkozs"/>
@@ -7892,7 +7926,7 @@
               <w:rPr>
                 <w:noProof/>
               </w:rPr>
-              <w:instrText xml:space="preserve"> PAGEREF _Toc226474495 \h </w:instrText>
+              <w:instrText xml:space="preserve"> PAGEREF _Toc227147812 \h </w:instrText>
             </w:r>
             <w:r>
               <w:rPr>
@@ -7932,7 +7966,7 @@
               <w:szCs w:val="22"/>
             </w:rPr>
           </w:pPr>
-          <w:hyperlink w:anchor="_Toc226474496" w:history="1">
+          <w:hyperlink w:anchor="_Toc227147813" w:history="1">
             <w:r>
               <w:rPr>
                 <w:rStyle w:val="Hiperhivatkozs"/>
@@ -7956,7 +7990,7 @@
               <w:rPr>
                 <w:noProof/>
               </w:rPr>
-              <w:instrText xml:space="preserve"> PAGEREF _Toc226474496 \h </w:instrText>
+              <w:instrText xml:space="preserve"> PAGEREF _Toc227147813 \h </w:instrText>
             </w:r>
             <w:r>
               <w:rPr>
@@ -7996,7 +8030,7 @@
               <w:szCs w:val="22"/>
             </w:rPr>
           </w:pPr>
-          <w:hyperlink w:anchor="_Toc226474497" w:history="1">
+          <w:hyperlink w:anchor="_Toc227147814" w:history="1">
             <w:r>
               <w:rPr>
                 <w:rStyle w:val="Hiperhivatkozs"/>
@@ -8020,7 +8054,7 @@
               <w:rPr>
                 <w:noProof/>
               </w:rPr>
-              <w:instrText xml:space="preserve"> PAGEREF _Toc226474497 \h </w:instrText>
+              <w:instrText xml:space="preserve"> PAGEREF _Toc227147814 \h </w:instrText>
             </w:r>
             <w:r>
               <w:rPr>
@@ -8037,7 +8071,7 @@
               <w:rPr>
                 <w:noProof/>
               </w:rPr>
-              <w:t>29</w:t>
+              <w:t>30</w:t>
             </w:r>
             <w:r>
               <w:rPr>
@@ -8060,7 +8094,7 @@
               <w:szCs w:val="22"/>
             </w:rPr>
           </w:pPr>
-          <w:hyperlink w:anchor="_Toc226474498" w:history="1">
+          <w:hyperlink w:anchor="_Toc227147815" w:history="1">
             <w:r>
               <w:rPr>
                 <w:rStyle w:val="Hiperhivatkozs"/>
@@ -8084,7 +8118,7 @@
               <w:rPr>
                 <w:noProof/>
               </w:rPr>
-              <w:instrText xml:space="preserve"> PAGEREF _Toc226474498 \h </w:instrText>
+              <w:instrText xml:space="preserve"> PAGEREF _Toc227147815 \h </w:instrText>
             </w:r>
             <w:r>
               <w:rPr>
@@ -8124,7 +8158,7 @@
               <w:szCs w:val="22"/>
             </w:rPr>
           </w:pPr>
-          <w:hyperlink w:anchor="_Toc226474499" w:history="1">
+          <w:hyperlink w:anchor="_Toc227147816" w:history="1">
             <w:r>
               <w:rPr>
                 <w:rStyle w:val="Hiperhivatkozs"/>
@@ -8148,7 +8182,7 @@
               <w:rPr>
                 <w:noProof/>
               </w:rPr>
-              <w:instrText xml:space="preserve"> PAGEREF _Toc226474499 \h </w:instrText>
+              <w:instrText xml:space="preserve"> PAGEREF _Toc227147816 \h </w:instrText>
             </w:r>
             <w:r>
               <w:rPr>
@@ -8165,7 +8199,7 @@
               <w:rPr>
                 <w:noProof/>
               </w:rPr>
-              <w:t>30</w:t>
+              <w:t>31</w:t>
             </w:r>
             <w:r>
               <w:rPr>
@@ -8188,7 +8222,7 @@
               <w:szCs w:val="22"/>
             </w:rPr>
           </w:pPr>
-          <w:hyperlink w:anchor="_Toc226474500" w:history="1">
+          <w:hyperlink w:anchor="_Toc227147817" w:history="1">
             <w:r>
               <w:rPr>
                 <w:rStyle w:val="Hiperhivatkozs"/>
@@ -8212,7 +8246,7 @@
               <w:rPr>
                 <w:noProof/>
               </w:rPr>
-              <w:instrText xml:space="preserve"> PAGEREF _Toc226474500 \h </w:instrText>
+              <w:instrText xml:space="preserve"> PAGEREF _Toc227147817 \h </w:instrText>
             </w:r>
             <w:r>
               <w:rPr>
@@ -8252,7 +8286,7 @@
               <w:szCs w:val="22"/>
             </w:rPr>
           </w:pPr>
-          <w:hyperlink w:anchor="_Toc226474501" w:history="1">
+          <w:hyperlink w:anchor="_Toc227147818" w:history="1">
             <w:r>
               <w:rPr>
                 <w:rStyle w:val="Hiperhivatkozs"/>
@@ -8276,7 +8310,7 @@
               <w:rPr>
                 <w:noProof/>
               </w:rPr>
-              <w:instrText xml:space="preserve"> PAGEREF _Toc226474501 \h </w:instrText>
+              <w:instrText xml:space="preserve"> PAGEREF _Toc227147818 \h </w:instrText>
             </w:r>
             <w:r>
               <w:rPr>
@@ -8316,7 +8350,7 @@
               <w:szCs w:val="22"/>
             </w:rPr>
           </w:pPr>
-          <w:hyperlink w:anchor="_Toc226474502" w:history="1">
+          <w:hyperlink w:anchor="_Toc227147819" w:history="1">
             <w:r>
               <w:rPr>
                 <w:rStyle w:val="Hiperhivatkozs"/>
@@ -8340,7 +8374,7 @@
               <w:rPr>
                 <w:noProof/>
               </w:rPr>
-              <w:instrText xml:space="preserve"> PAGEREF _Toc226474502 \h </w:instrText>
+              <w:instrText xml:space="preserve"> PAGEREF _Toc227147819 \h </w:instrText>
             </w:r>
             <w:r>
               <w:rPr>
@@ -8380,7 +8414,7 @@
               <w:szCs w:val="22"/>
             </w:rPr>
           </w:pPr>
-          <w:hyperlink w:anchor="_Toc226474503" w:history="1">
+          <w:hyperlink w:anchor="_Toc227147820" w:history="1">
             <w:r>
               <w:rPr>
                 <w:rStyle w:val="Hiperhivatkozs"/>
@@ -8404,7 +8438,7 @@
               <w:rPr>
                 <w:noProof/>
               </w:rPr>
-              <w:instrText xml:space="preserve"> PAGEREF _Toc226474503 \h </w:instrText>
+              <w:instrText xml:space="preserve"> PAGEREF _Toc227147820 \h </w:instrText>
             </w:r>
             <w:r>
               <w:rPr>
@@ -8444,7 +8478,7 @@
               <w:szCs w:val="22"/>
             </w:rPr>
           </w:pPr>
-          <w:hyperlink w:anchor="_Toc226474504" w:history="1">
+          <w:hyperlink w:anchor="_Toc227147821" w:history="1">
             <w:r>
               <w:rPr>
                 <w:rStyle w:val="Hiperhivatkozs"/>
@@ -8468,7 +8502,7 @@
               <w:rPr>
                 <w:noProof/>
               </w:rPr>
-              <w:instrText xml:space="preserve"> PAGEREF _Toc226474504 \h </w:instrText>
+              <w:instrText xml:space="preserve"> PAGEREF _Toc227147821 \h </w:instrText>
             </w:r>
             <w:r>
               <w:rPr>
@@ -8508,7 +8542,7 @@
               <w:szCs w:val="22"/>
             </w:rPr>
           </w:pPr>
-          <w:hyperlink w:anchor="_Toc226474505" w:history="1">
+          <w:hyperlink w:anchor="_Toc227147822" w:history="1">
             <w:r>
               <w:rPr>
                 <w:rStyle w:val="Hiperhivatkozs"/>
@@ -8532,7 +8566,7 @@
               <w:rPr>
                 <w:noProof/>
               </w:rPr>
-              <w:instrText xml:space="preserve"> PAGEREF _Toc226474505 \h </w:instrText>
+              <w:instrText xml:space="preserve"> PAGEREF _Toc227147822 \h </w:instrText>
             </w:r>
             <w:r>
               <w:rPr>
@@ -8572,7 +8606,7 @@
               <w:szCs w:val="22"/>
             </w:rPr>
           </w:pPr>
-          <w:hyperlink w:anchor="_Toc226474506" w:history="1">
+          <w:hyperlink w:anchor="_Toc227147823" w:history="1">
             <w:r>
               <w:rPr>
                 <w:rStyle w:val="Hiperhivatkozs"/>
@@ -8596,7 +8630,7 @@
               <w:rPr>
                 <w:noProof/>
               </w:rPr>
-              <w:instrText xml:space="preserve"> PAGEREF _Toc226474506 \h </w:instrText>
+              <w:instrText xml:space="preserve"> PAGEREF _Toc227147823 \h </w:instrText>
             </w:r>
             <w:r>
               <w:rPr>
@@ -8636,7 +8670,7 @@
               <w:szCs w:val="22"/>
             </w:rPr>
           </w:pPr>
-          <w:hyperlink w:anchor="_Toc226474507" w:history="1">
+          <w:hyperlink w:anchor="_Toc227147824" w:history="1">
             <w:r>
               <w:rPr>
                 <w:rStyle w:val="Hiperhivatkozs"/>
@@ -8660,7 +8694,7 @@
               <w:rPr>
                 <w:noProof/>
               </w:rPr>
-              <w:instrText xml:space="preserve"> PAGEREF _Toc226474507 \h </w:instrText>
+              <w:instrText xml:space="preserve"> PAGEREF _Toc227147824 \h </w:instrText>
             </w:r>
             <w:r>
               <w:rPr>
@@ -8700,7 +8734,7 @@
               <w:szCs w:val="22"/>
             </w:rPr>
           </w:pPr>
-          <w:hyperlink w:anchor="_Toc226474508" w:history="1">
+          <w:hyperlink w:anchor="_Toc227147825" w:history="1">
             <w:r>
               <w:rPr>
                 <w:rStyle w:val="Hiperhivatkozs"/>
@@ -8724,7 +8758,7 @@
               <w:rPr>
                 <w:noProof/>
               </w:rPr>
-              <w:instrText xml:space="preserve"> PAGEREF _Toc226474508 \h </w:instrText>
+              <w:instrText xml:space="preserve"> PAGEREF _Toc227147825 \h </w:instrText>
             </w:r>
             <w:r>
               <w:rPr>
@@ -8764,7 +8798,7 @@
               <w:szCs w:val="22"/>
             </w:rPr>
           </w:pPr>
-          <w:hyperlink w:anchor="_Toc226474509" w:history="1">
+          <w:hyperlink w:anchor="_Toc227147826" w:history="1">
             <w:r>
               <w:rPr>
                 <w:rStyle w:val="Hiperhivatkozs"/>
@@ -8788,7 +8822,7 @@
               <w:rPr>
                 <w:noProof/>
               </w:rPr>
-              <w:instrText xml:space="preserve"> PAGEREF _Toc226474509 \h </w:instrText>
+              <w:instrText xml:space="preserve"> PAGEREF _Toc227147826 \h </w:instrText>
             </w:r>
             <w:r>
               <w:rPr>
@@ -8828,7 +8862,7 @@
               <w:szCs w:val="22"/>
             </w:rPr>
           </w:pPr>
-          <w:hyperlink w:anchor="_Toc226474510" w:history="1">
+          <w:hyperlink w:anchor="_Toc227147827" w:history="1">
             <w:r>
               <w:rPr>
                 <w:rStyle w:val="Hiperhivatkozs"/>
@@ -8852,7 +8886,7 @@
               <w:rPr>
                 <w:noProof/>
               </w:rPr>
-              <w:instrText xml:space="preserve"> PAGEREF _Toc226474510 \h </w:instrText>
+              <w:instrText xml:space="preserve"> PAGEREF _Toc227147827 \h </w:instrText>
             </w:r>
             <w:r>
               <w:rPr>
@@ -8869,7 +8903,7 @@
               <w:rPr>
                 <w:noProof/>
               </w:rPr>
-              <w:t>33</w:t>
+              <w:t>34</w:t>
             </w:r>
             <w:r>
               <w:rPr>
@@ -8892,7 +8926,7 @@
               <w:szCs w:val="22"/>
             </w:rPr>
           </w:pPr>
-          <w:hyperlink w:anchor="_Toc226474511" w:history="1">
+          <w:hyperlink w:anchor="_Toc227147828" w:history="1">
             <w:r>
               <w:rPr>
                 <w:rStyle w:val="Hiperhivatkozs"/>
@@ -8916,7 +8950,7 @@
               <w:rPr>
                 <w:noProof/>
               </w:rPr>
-              <w:instrText xml:space="preserve"> PAGEREF _Toc226474511 \h </w:instrText>
+              <w:instrText xml:space="preserve"> PAGEREF _Toc227147828 \h </w:instrText>
             </w:r>
             <w:r>
               <w:rPr>
@@ -8956,7 +8990,7 @@
               <w:szCs w:val="22"/>
             </w:rPr>
           </w:pPr>
-          <w:hyperlink w:anchor="_Toc226474512" w:history="1">
+          <w:hyperlink w:anchor="_Toc227147829" w:history="1">
             <w:r>
               <w:rPr>
                 <w:rStyle w:val="Hiperhivatkozs"/>
@@ -8980,7 +9014,7 @@
               <w:rPr>
                 <w:noProof/>
               </w:rPr>
-              <w:instrText xml:space="preserve"> PAGEREF _Toc226474512 \h </w:instrText>
+              <w:instrText xml:space="preserve"> PAGEREF _Toc227147829 \h </w:instrText>
             </w:r>
             <w:r>
               <w:rPr>
@@ -9020,7 +9054,7 @@
               <w:szCs w:val="22"/>
             </w:rPr>
           </w:pPr>
-          <w:hyperlink w:anchor="_Toc226474513" w:history="1">
+          <w:hyperlink w:anchor="_Toc227147830" w:history="1">
             <w:r>
               <w:rPr>
                 <w:rStyle w:val="Hiperhivatkozs"/>
@@ -9044,7 +9078,7 @@
               <w:rPr>
                 <w:noProof/>
               </w:rPr>
-              <w:instrText xml:space="preserve"> PAGEREF _Toc226474513 \h </w:instrText>
+              <w:instrText xml:space="preserve"> PAGEREF _Toc227147830 \h </w:instrText>
             </w:r>
             <w:r>
               <w:rPr>
@@ -9084,7 +9118,7 @@
               <w:szCs w:val="22"/>
             </w:rPr>
           </w:pPr>
-          <w:hyperlink w:anchor="_Toc226474514" w:history="1">
+          <w:hyperlink w:anchor="_Toc227147831" w:history="1">
             <w:r>
               <w:rPr>
                 <w:rStyle w:val="Hiperhivatkozs"/>
@@ -9108,7 +9142,7 @@
               <w:rPr>
                 <w:noProof/>
               </w:rPr>
-              <w:instrText xml:space="preserve"> PAGEREF _Toc226474514 \h </w:instrText>
+              <w:instrText xml:space="preserve"> PAGEREF _Toc227147831 \h </w:instrText>
             </w:r>
             <w:r>
               <w:rPr>
@@ -9148,7 +9182,7 @@
               <w:szCs w:val="22"/>
             </w:rPr>
           </w:pPr>
-          <w:hyperlink w:anchor="_Toc226474515" w:history="1">
+          <w:hyperlink w:anchor="_Toc227147832" w:history="1">
             <w:r>
               <w:rPr>
                 <w:rStyle w:val="Hiperhivatkozs"/>
@@ -9172,7 +9206,7 @@
               <w:rPr>
                 <w:noProof/>
               </w:rPr>
-              <w:instrText xml:space="preserve"> PAGEREF _Toc226474515 \h </w:instrText>
+              <w:instrText xml:space="preserve"> PAGEREF _Toc227147832 \h </w:instrText>
             </w:r>
             <w:r>
               <w:rPr>
@@ -9212,7 +9246,7 @@
               <w:szCs w:val="22"/>
             </w:rPr>
           </w:pPr>
-          <w:hyperlink w:anchor="_Toc226474516" w:history="1">
+          <w:hyperlink w:anchor="_Toc227147833" w:history="1">
             <w:r>
               <w:rPr>
                 <w:rStyle w:val="Hiperhivatkozs"/>
@@ -9236,7 +9270,7 @@
               <w:rPr>
                 <w:noProof/>
               </w:rPr>
-              <w:instrText xml:space="preserve"> PAGEREF _Toc226474516 \h </w:instrText>
+              <w:instrText xml:space="preserve"> PAGEREF _Toc227147833 \h </w:instrText>
             </w:r>
             <w:r>
               <w:rPr>
@@ -9276,7 +9310,7 @@
               <w:szCs w:val="22"/>
             </w:rPr>
           </w:pPr>
-          <w:hyperlink w:anchor="_Toc226474517" w:history="1">
+          <w:hyperlink w:anchor="_Toc227147834" w:history="1">
             <w:r>
               <w:rPr>
                 <w:rStyle w:val="Hiperhivatkozs"/>
@@ -9300,7 +9334,7 @@
               <w:rPr>
                 <w:noProof/>
               </w:rPr>
-              <w:instrText xml:space="preserve"> PAGEREF _Toc226474517 \h </w:instrText>
+              <w:instrText xml:space="preserve"> PAGEREF _Toc227147834 \h </w:instrText>
             </w:r>
             <w:r>
               <w:rPr>
@@ -9340,7 +9374,7 @@
               <w:szCs w:val="22"/>
             </w:rPr>
           </w:pPr>
-          <w:hyperlink w:anchor="_Toc226474518" w:history="1">
+          <w:hyperlink w:anchor="_Toc227147835" w:history="1">
             <w:r>
               <w:rPr>
                 <w:rStyle w:val="Hiperhivatkozs"/>
@@ -9364,7 +9398,7 @@
               <w:rPr>
                 <w:noProof/>
               </w:rPr>
-              <w:instrText xml:space="preserve"> PAGEREF _Toc226474518 \h </w:instrText>
+              <w:instrText xml:space="preserve"> PAGEREF _Toc227147835 \h </w:instrText>
             </w:r>
             <w:r>
               <w:rPr>
@@ -9404,7 +9438,7 @@
               <w:szCs w:val="22"/>
             </w:rPr>
           </w:pPr>
-          <w:hyperlink w:anchor="_Toc226474519" w:history="1">
+          <w:hyperlink w:anchor="_Toc227147836" w:history="1">
             <w:r>
               <w:rPr>
                 <w:rStyle w:val="Hiperhivatkozs"/>
@@ -9428,7 +9462,7 @@
               <w:rPr>
                 <w:noProof/>
               </w:rPr>
-              <w:instrText xml:space="preserve"> PAGEREF _Toc226474519 \h </w:instrText>
+              <w:instrText xml:space="preserve"> PAGEREF _Toc227147836 \h </w:instrText>
             </w:r>
             <w:r>
               <w:rPr>
@@ -9468,13 +9502,13 @@
               <w:szCs w:val="22"/>
             </w:rPr>
           </w:pPr>
-          <w:hyperlink w:anchor="_Toc226474520" w:history="1">
+          <w:hyperlink w:anchor="_Toc227147837" w:history="1">
             <w:r>
               <w:rPr>
                 <w:rStyle w:val="Hiperhivatkozs"/>
                 <w:noProof/>
               </w:rPr>
-              <w:t>10. Források</w:t>
+              <w:t>10. Források / Irodalomjegyzék</w:t>
             </w:r>
             <w:r>
               <w:rPr>
@@ -9492,7 +9526,7 @@
               <w:rPr>
                 <w:noProof/>
               </w:rPr>
-              <w:instrText xml:space="preserve"> PAGEREF _Toc226474520 \h </w:instrText>
+              <w:instrText xml:space="preserve"> PAGEREF _Toc227147837 \h </w:instrText>
             </w:r>
             <w:r>
               <w:rPr>
@@ -9538,22 +9572,22 @@
           <w:bottom w:val="single" w:sz="6" w:space="1" w:color="2E75B6"/>
         </w:pBdr>
       </w:pPr>
-      <w:bookmarkStart w:id="1" w:name="_Toc226474408"/>
+      <w:bookmarkStart w:id="0" w:name="_Toc227147725"/>
       <w:r>
         <w:lastRenderedPageBreak/>
         <w:t>1. Bevezetés</w:t>
       </w:r>
+      <w:bookmarkEnd w:id="0"/>
+    </w:p>
+    <w:p>
+      <w:pPr>
+        <w:pStyle w:val="Cmsor2"/>
+      </w:pPr>
+      <w:bookmarkStart w:id="1" w:name="_Toc227147726"/>
+      <w:r>
+        <w:t>1.1 Probléma és megoldás</w:t>
+      </w:r>
       <w:bookmarkEnd w:id="1"/>
-    </w:p>
-    <w:p>
-      <w:pPr>
-        <w:pStyle w:val="Cmsor2"/>
-      </w:pPr>
-      <w:bookmarkStart w:id="2" w:name="_Toc226474409"/>
-      <w:r>
-        <w:t>1.1 Probléma és megoldás</w:t>
-      </w:r>
-      <w:bookmarkEnd w:id="2"/>
     </w:p>
     <w:p>
       <w:pPr>
@@ -9593,11 +9627,11 @@
       <w:pPr>
         <w:pStyle w:val="Cmsor2"/>
       </w:pPr>
-      <w:bookmarkStart w:id="3" w:name="_Toc226474410"/>
+      <w:bookmarkStart w:id="2" w:name="_Toc227147727"/>
       <w:r>
         <w:t>1.2 Kezdet</w:t>
       </w:r>
-      <w:bookmarkEnd w:id="3"/>
+      <w:bookmarkEnd w:id="2"/>
     </w:p>
     <w:p>
       <w:pPr>
@@ -9620,11 +9654,11 @@
       <w:pPr>
         <w:pStyle w:val="Cmsor3"/>
       </w:pPr>
-      <w:bookmarkStart w:id="4" w:name="_Toc226474411"/>
+      <w:bookmarkStart w:id="3" w:name="_Toc227147728"/>
       <w:r>
         <w:t>1.2.1 Technológiák</w:t>
       </w:r>
-      <w:bookmarkEnd w:id="4"/>
+      <w:bookmarkEnd w:id="3"/>
     </w:p>
     <w:p>
       <w:pPr>
@@ -10701,12 +10735,12 @@
       <w:pPr>
         <w:pStyle w:val="Cmsor2"/>
       </w:pPr>
-      <w:bookmarkStart w:id="5" w:name="_Toc226474412"/>
+      <w:bookmarkStart w:id="4" w:name="_Toc227147729"/>
       <w:r>
         <w:lastRenderedPageBreak/>
         <w:t>1.3 Jövőbeni tervek</w:t>
       </w:r>
-      <w:bookmarkEnd w:id="5"/>
+      <w:bookmarkEnd w:id="4"/>
     </w:p>
     <w:p>
       <w:pPr>
@@ -10816,22 +10850,22 @@
           <w:bottom w:val="single" w:sz="6" w:space="1" w:color="2E75B6"/>
         </w:pBdr>
       </w:pPr>
-      <w:bookmarkStart w:id="6" w:name="_Toc226474413"/>
+      <w:bookmarkStart w:id="5" w:name="_Toc227147730"/>
       <w:r>
         <w:lastRenderedPageBreak/>
         <w:t>2. Csapatmunka megvalósítása</w:t>
       </w:r>
+      <w:bookmarkEnd w:id="5"/>
+    </w:p>
+    <w:p>
+      <w:pPr>
+        <w:pStyle w:val="Cmsor2"/>
+      </w:pPr>
+      <w:bookmarkStart w:id="6" w:name="_Toc227147731"/>
+      <w:r>
+        <w:t>2.1 Feladatok felosztása</w:t>
+      </w:r>
       <w:bookmarkEnd w:id="6"/>
-    </w:p>
-    <w:p>
-      <w:pPr>
-        <w:pStyle w:val="Cmsor2"/>
-      </w:pPr>
-      <w:bookmarkStart w:id="7" w:name="_Toc226474414"/>
-      <w:r>
-        <w:t>2.1 Feladatok felosztása</w:t>
-      </w:r>
-      <w:bookmarkEnd w:id="7"/>
     </w:p>
     <w:p>
       <w:pPr>
@@ -11502,11 +11536,11 @@
       <w:pPr>
         <w:pStyle w:val="Cmsor2"/>
       </w:pPr>
-      <w:bookmarkStart w:id="8" w:name="_Toc226474415"/>
+      <w:bookmarkStart w:id="7" w:name="_Toc227147732"/>
       <w:r>
         <w:t>2.2 Git és GitHub</w:t>
       </w:r>
-      <w:bookmarkEnd w:id="8"/>
+      <w:bookmarkEnd w:id="7"/>
     </w:p>
     <w:p>
       <w:pPr>
@@ -11535,7 +11569,13 @@
         <w:spacing w:before="40" w:after="40"/>
       </w:pPr>
       <w:r>
-        <w:t>Backend repository: https://github.com/FleetFlow-Zarodolgozat/FleetFlow_backend</w:t>
+        <w:t xml:space="preserve">Backend repository: </w:t>
+      </w:r>
+      <w:r>
+        <w:rPr>
+          <w:rStyle w:val="LinkChar"/>
+        </w:rPr>
+        <w:t>https://github.com/FleetFlow-Zarodolgozat/FleetFlow_backend</w:t>
       </w:r>
     </w:p>
     <w:p>
@@ -11548,7 +11588,13 @@
         <w:spacing w:before="40" w:after="40"/>
       </w:pPr>
       <w:r>
-        <w:t>Mobil repository: https://github.com/FleetFlow-Zarodolgozat/FleetFlow_mobil</w:t>
+        <w:t xml:space="preserve">Mobil repository: </w:t>
+      </w:r>
+      <w:r>
+        <w:rPr>
+          <w:rStyle w:val="LinkChar"/>
+        </w:rPr>
+        <w:t>https://github.com/FleetFlow-Zarodolgozat/FleetFlow_mobil</w:t>
       </w:r>
     </w:p>
     <w:p>
@@ -11561,7 +11607,13 @@
         <w:spacing w:before="40" w:after="40"/>
       </w:pPr>
       <w:r>
-        <w:t>Frontend repository: https://github.com/FleetFlow-Zarodolgozat/FleetFlow_frontend</w:t>
+        <w:t xml:space="preserve">Frontend repository: </w:t>
+      </w:r>
+      <w:r>
+        <w:rPr>
+          <w:rStyle w:val="LinkChar"/>
+        </w:rPr>
+        <w:t>https://github.com/FleetFlow-Zarodolgozat/FleetFlow_frontend</w:t>
       </w:r>
     </w:p>
     <w:p>
@@ -11610,22 +11662,22 @@
           <w:bottom w:val="single" w:sz="6" w:space="1" w:color="2E75B6"/>
         </w:pBdr>
       </w:pPr>
-      <w:bookmarkStart w:id="9" w:name="_Toc226474416"/>
+      <w:bookmarkStart w:id="8" w:name="_Toc227147733"/>
       <w:r>
         <w:lastRenderedPageBreak/>
         <w:t>3. Adatbázis</w:t>
       </w:r>
+      <w:bookmarkEnd w:id="8"/>
+    </w:p>
+    <w:p>
+      <w:pPr>
+        <w:pStyle w:val="Cmsor2"/>
+      </w:pPr>
+      <w:bookmarkStart w:id="9" w:name="_Toc227147734"/>
+      <w:r>
+        <w:t>3.1 Adatbázis-kezelő rendszer</w:t>
+      </w:r>
       <w:bookmarkEnd w:id="9"/>
-    </w:p>
-    <w:p>
-      <w:pPr>
-        <w:pStyle w:val="Cmsor2"/>
-      </w:pPr>
-      <w:bookmarkStart w:id="10" w:name="_Toc226474417"/>
-      <w:r>
-        <w:t>3.1 Adatbázis-kezelő rendszer</w:t>
-      </w:r>
-      <w:bookmarkEnd w:id="10"/>
     </w:p>
     <w:p>
       <w:pPr>
@@ -11682,11 +11734,11 @@
       <w:pPr>
         <w:pStyle w:val="Cmsor2"/>
       </w:pPr>
-      <w:bookmarkStart w:id="11" w:name="_Toc226474418"/>
+      <w:bookmarkStart w:id="10" w:name="_Toc227147735"/>
       <w:r>
         <w:t>3.2 Adatbázis-séma áttekintése</w:t>
       </w:r>
-      <w:bookmarkEnd w:id="11"/>
+      <w:bookmarkEnd w:id="10"/>
     </w:p>
     <w:p>
       <w:pPr>
@@ -12420,21 +12472,21 @@
       <w:pPr>
         <w:pStyle w:val="Cmsor2"/>
       </w:pPr>
-      <w:bookmarkStart w:id="12" w:name="_Toc226474419"/>
+      <w:bookmarkStart w:id="11" w:name="_Toc227147736"/>
       <w:r>
         <w:t>3.3 Táblák részletes leírása</w:t>
       </w:r>
+      <w:bookmarkEnd w:id="11"/>
+    </w:p>
+    <w:p>
+      <w:pPr>
+        <w:pStyle w:val="Cmsor3"/>
+      </w:pPr>
+      <w:bookmarkStart w:id="12" w:name="_Toc227147737"/>
+      <w:r>
+        <w:t>3.3.1 users tábla</w:t>
+      </w:r>
       <w:bookmarkEnd w:id="12"/>
-    </w:p>
-    <w:p>
-      <w:pPr>
-        <w:pStyle w:val="Cmsor3"/>
-      </w:pPr>
-      <w:bookmarkStart w:id="13" w:name="_Toc226474420"/>
-      <w:r>
-        <w:t>3.3.1 users tábla</w:t>
-      </w:r>
-      <w:bookmarkEnd w:id="13"/>
     </w:p>
     <w:p>
       <w:pPr>
@@ -13462,11 +13514,11 @@
       <w:pPr>
         <w:pStyle w:val="Cmsor3"/>
       </w:pPr>
-      <w:bookmarkStart w:id="14" w:name="_Toc226474421"/>
+      <w:bookmarkStart w:id="13" w:name="_Toc227147738"/>
       <w:r>
         <w:t>3.3.2 drivers tábla</w:t>
       </w:r>
-      <w:bookmarkEnd w:id="14"/>
+      <w:bookmarkEnd w:id="13"/>
     </w:p>
     <w:p>
       <w:pPr>
@@ -14042,11 +14094,11 @@
       <w:pPr>
         <w:pStyle w:val="Cmsor3"/>
       </w:pPr>
-      <w:bookmarkStart w:id="15" w:name="_Toc226474422"/>
+      <w:bookmarkStart w:id="14" w:name="_Toc227147739"/>
       <w:r>
         <w:t>3.3.3 vehicles tábla</w:t>
       </w:r>
-      <w:bookmarkEnd w:id="15"/>
+      <w:bookmarkEnd w:id="14"/>
     </w:p>
     <w:p>
       <w:pPr>
@@ -14981,11 +15033,11 @@
       <w:pPr>
         <w:pStyle w:val="Cmsor3"/>
       </w:pPr>
-      <w:bookmarkStart w:id="16" w:name="_Toc226474423"/>
+      <w:bookmarkStart w:id="15" w:name="_Toc227147740"/>
       <w:r>
         <w:t>3.3.4 vehicle_assignments tábla</w:t>
       </w:r>
-      <w:bookmarkEnd w:id="16"/>
+      <w:bookmarkEnd w:id="15"/>
     </w:p>
     <w:p>
       <w:pPr>
@@ -15636,11 +15688,11 @@
       <w:pPr>
         <w:pStyle w:val="Cmsor3"/>
       </w:pPr>
-      <w:bookmarkStart w:id="17" w:name="_Toc226474424"/>
+      <w:bookmarkStart w:id="16" w:name="_Toc227147741"/>
       <w:r>
         <w:t>3.3.5 files tábla</w:t>
       </w:r>
-      <w:bookmarkEnd w:id="17"/>
+      <w:bookmarkEnd w:id="16"/>
     </w:p>
     <w:p>
       <w:pPr>
@@ -16483,11 +16535,11 @@
       <w:pPr>
         <w:pStyle w:val="Cmsor3"/>
       </w:pPr>
-      <w:bookmarkStart w:id="18" w:name="_Toc226474425"/>
+      <w:bookmarkStart w:id="17" w:name="_Toc227147742"/>
       <w:r>
         <w:t>3.3.6 fuel_logs tábla</w:t>
       </w:r>
-      <w:bookmarkEnd w:id="18"/>
+      <w:bookmarkEnd w:id="17"/>
     </w:p>
     <w:p>
       <w:pPr>
@@ -17598,11 +17650,11 @@
       <w:pPr>
         <w:pStyle w:val="Cmsor3"/>
       </w:pPr>
-      <w:bookmarkStart w:id="19" w:name="_Toc226474426"/>
+      <w:bookmarkStart w:id="18" w:name="_Toc227147743"/>
       <w:r>
         <w:t>3.3.7 trips tábla</w:t>
       </w:r>
-      <w:bookmarkEnd w:id="19"/>
+      <w:bookmarkEnd w:id="18"/>
     </w:p>
     <w:p>
       <w:pPr>
@@ -18786,11 +18838,11 @@
       <w:pPr>
         <w:pStyle w:val="Cmsor3"/>
       </w:pPr>
-      <w:bookmarkStart w:id="20" w:name="_Toc226474427"/>
+      <w:bookmarkStart w:id="19" w:name="_Toc227147744"/>
       <w:r>
         <w:t>3.3.8 service_requests tábla</w:t>
       </w:r>
-      <w:bookmarkEnd w:id="20"/>
+      <w:bookmarkEnd w:id="19"/>
     </w:p>
     <w:p>
       <w:pPr>
@@ -19188,11 +19240,11 @@
       <w:pPr>
         <w:pStyle w:val="Cmsor3"/>
       </w:pPr>
-      <w:bookmarkStart w:id="21" w:name="_Toc226474428"/>
+      <w:bookmarkStart w:id="20" w:name="_Toc227147745"/>
       <w:r>
         <w:t>3.3.9 calendar_events tábla</w:t>
       </w:r>
-      <w:bookmarkEnd w:id="21"/>
+      <w:bookmarkEnd w:id="20"/>
     </w:p>
     <w:p>
       <w:pPr>
@@ -19215,11 +19267,11 @@
       <w:pPr>
         <w:pStyle w:val="Cmsor3"/>
       </w:pPr>
-      <w:bookmarkStart w:id="22" w:name="_Toc226474429"/>
+      <w:bookmarkStart w:id="21" w:name="_Toc227147746"/>
       <w:r>
         <w:t>3.3.10 notifications tábla</w:t>
       </w:r>
-      <w:bookmarkEnd w:id="22"/>
+      <w:bookmarkEnd w:id="21"/>
     </w:p>
     <w:p>
       <w:pPr>
@@ -19263,11 +19315,11 @@
       <w:pPr>
         <w:pStyle w:val="Cmsor3"/>
       </w:pPr>
-      <w:bookmarkStart w:id="23" w:name="_Toc226474430"/>
+      <w:bookmarkStart w:id="22" w:name="_Toc227147747"/>
       <w:r>
         <w:t>3.3.11 password_tokens tábla</w:t>
       </w:r>
-      <w:bookmarkEnd w:id="23"/>
+      <w:bookmarkEnd w:id="22"/>
     </w:p>
     <w:p>
       <w:pPr>
@@ -19290,11 +19342,11 @@
       <w:pPr>
         <w:pStyle w:val="Cmsor2"/>
       </w:pPr>
-      <w:bookmarkStart w:id="24" w:name="_Toc226474431"/>
+      <w:bookmarkStart w:id="23" w:name="_Toc227147748"/>
       <w:r>
         <w:t>3.4 Adatbázis kapcsolatok</w:t>
       </w:r>
-      <w:bookmarkEnd w:id="24"/>
+      <w:bookmarkEnd w:id="23"/>
     </w:p>
     <w:p>
       <w:pPr>
@@ -20583,22 +20635,22 @@
           <w:bottom w:val="single" w:sz="6" w:space="1" w:color="2E75B6"/>
         </w:pBdr>
       </w:pPr>
-      <w:bookmarkStart w:id="25" w:name="_Toc226474432"/>
+      <w:bookmarkStart w:id="24" w:name="_Toc227147749"/>
       <w:r>
         <w:lastRenderedPageBreak/>
         <w:t>4. Backend</w:t>
       </w:r>
+      <w:bookmarkEnd w:id="24"/>
+    </w:p>
+    <w:p>
+      <w:pPr>
+        <w:pStyle w:val="Cmsor2"/>
+      </w:pPr>
+      <w:bookmarkStart w:id="25" w:name="_Toc227147750"/>
+      <w:r>
+        <w:t>4.1 Technológia</w:t>
+      </w:r>
       <w:bookmarkEnd w:id="25"/>
-    </w:p>
-    <w:p>
-      <w:pPr>
-        <w:pStyle w:val="Cmsor2"/>
-      </w:pPr>
-      <w:bookmarkStart w:id="26" w:name="_Toc226474433"/>
-      <w:r>
-        <w:t>4.1 Technológia</w:t>
-      </w:r>
-      <w:bookmarkEnd w:id="26"/>
     </w:p>
     <w:p>
       <w:pPr>
@@ -20626,7 +20678,19 @@
         <w:rPr>
           <w:color w:val="000000"/>
         </w:rPr>
-        <w:t>Az alkalmazás REST API-t valósít meg, amelyhez a Swagger / OpenAPI dokumentáció is automatikusan generálódik. Fejlesztési módban a Swagger UI elérhető a http://localhost:5000/swagger címen, ami megkönnyíti az API végpontok tesztelését és dokumentálását.</w:t>
+        <w:t xml:space="preserve">Az alkalmazás REST API-t valósít meg, amelyhez a Swagger / OpenAPI dokumentáció is automatikusan generálódik. Fejlesztési módban a Swagger UI elérhető a </w:t>
+      </w:r>
+      <w:r>
+        <w:rPr>
+          <w:rStyle w:val="LinkChar"/>
+        </w:rPr>
+        <w:t>http://localhost:5000/swagger</w:t>
+      </w:r>
+      <w:r>
+        <w:rPr>
+          <w:color w:val="000000"/>
+        </w:rPr>
+        <w:t xml:space="preserve"> címen, ami megkönnyíti az API végpontok tesztelését és dokumentálását.</w:t>
       </w:r>
     </w:p>
     <w:p>
@@ -20638,11 +20702,11 @@
       <w:pPr>
         <w:pStyle w:val="Cmsor2"/>
       </w:pPr>
-      <w:bookmarkStart w:id="27" w:name="_Toc226474434"/>
+      <w:bookmarkStart w:id="26" w:name="_Toc227147751"/>
       <w:r>
         <w:t>4.2 Projekstruktúra</w:t>
       </w:r>
-      <w:bookmarkEnd w:id="27"/>
+      <w:bookmarkEnd w:id="26"/>
     </w:p>
     <w:p>
       <w:pPr>
@@ -20795,11 +20859,11 @@
       <w:pPr>
         <w:pStyle w:val="Cmsor2"/>
       </w:pPr>
-      <w:bookmarkStart w:id="28" w:name="_Toc226474435"/>
+      <w:bookmarkStart w:id="27" w:name="_Toc227147752"/>
       <w:r>
         <w:t>4.3 Hitelesítés és szerepkörok</w:t>
       </w:r>
-      <w:bookmarkEnd w:id="28"/>
+      <w:bookmarkEnd w:id="27"/>
     </w:p>
     <w:p>
       <w:pPr>
@@ -20901,11 +20965,11 @@
       <w:pPr>
         <w:pStyle w:val="Cmsor2"/>
       </w:pPr>
-      <w:bookmarkStart w:id="29" w:name="_Toc226474436"/>
+      <w:bookmarkStart w:id="28" w:name="_Toc227147753"/>
       <w:r>
         <w:t>4.4 Jelszótitkosítás</w:t>
       </w:r>
-      <w:bookmarkEnd w:id="29"/>
+      <w:bookmarkEnd w:id="28"/>
     </w:p>
     <w:p>
       <w:pPr>
@@ -20921,18 +20985,14 @@
     </w:p>
     <w:p>
       <w:pPr>
-        <w:spacing w:before="80" w:after="80"/>
-      </w:pPr>
-    </w:p>
-    <w:p>
-      <w:pPr>
         <w:pStyle w:val="Cmsor2"/>
       </w:pPr>
-      <w:bookmarkStart w:id="30" w:name="_Toc226474437"/>
-      <w:r>
+      <w:bookmarkStart w:id="29" w:name="_Toc227147754"/>
+      <w:r>
+        <w:lastRenderedPageBreak/>
         <w:t>4.5 E-mail funkciók</w:t>
       </w:r>
-      <w:bookmarkEnd w:id="30"/>
+      <w:bookmarkEnd w:id="29"/>
     </w:p>
     <w:p>
       <w:pPr>
@@ -21438,11 +21498,11 @@
       <w:pPr>
         <w:pStyle w:val="Cmsor2"/>
       </w:pPr>
-      <w:bookmarkStart w:id="31" w:name="_Toc226474438"/>
+      <w:bookmarkStart w:id="30" w:name="_Toc227147755"/>
       <w:r>
         <w:t>4.6 API végpontok</w:t>
       </w:r>
-      <w:bookmarkEnd w:id="31"/>
+      <w:bookmarkEnd w:id="30"/>
     </w:p>
     <w:p>
       <w:pPr>
@@ -21453,7 +21513,19 @@
         <w:rPr>
           <w:color w:val="000000"/>
         </w:rPr>
-        <w:t>Az API alap URL-je: https://fleetflow-zarodolgozat-backend-ressdominik.jcloud.jedlik.cloud. Minden védett végpont JWT tokent igényel az Authorization: Bearer fejlécben.</w:t>
+        <w:t xml:space="preserve">Az API alap URL-je: </w:t>
+      </w:r>
+      <w:r>
+        <w:rPr>
+          <w:rStyle w:val="LinkChar"/>
+        </w:rPr>
+        <w:t>https://fleetflow-zarodolgozat-backend-ressdominik.jcloud.jedlik.cloud</w:t>
+      </w:r>
+      <w:r>
+        <w:rPr>
+          <w:color w:val="000000"/>
+        </w:rPr>
+        <w:t>. Minden védett végpont JWT tokent igényel az Authorization: Bearer fejlécben.</w:t>
       </w:r>
     </w:p>
     <w:p>
@@ -21465,11 +21537,11 @@
       <w:pPr>
         <w:pStyle w:val="Cmsor3"/>
       </w:pPr>
-      <w:bookmarkStart w:id="32" w:name="_Toc226474439"/>
+      <w:bookmarkStart w:id="31" w:name="_Toc227147756"/>
       <w:r>
         <w:t>4.6.1 Hitelesítés (/api)</w:t>
       </w:r>
-      <w:bookmarkEnd w:id="32"/>
+      <w:bookmarkEnd w:id="31"/>
     </w:p>
     <w:tbl>
       <w:tblPr>
@@ -21858,11 +21930,11 @@
       <w:pPr>
         <w:pStyle w:val="Cmsor3"/>
       </w:pPr>
-      <w:bookmarkStart w:id="33" w:name="_Toc226474440"/>
+      <w:bookmarkStart w:id="32" w:name="_Toc227147757"/>
       <w:r>
         <w:t>4.6.2 Sofőrkezelés (/api/admin/drivers) – ADMIN</w:t>
       </w:r>
-      <w:bookmarkEnd w:id="33"/>
+      <w:bookmarkEnd w:id="32"/>
     </w:p>
     <w:tbl>
       <w:tblPr>
@@ -22412,11 +22484,11 @@
       <w:pPr>
         <w:pStyle w:val="Cmsor3"/>
       </w:pPr>
-      <w:bookmarkStart w:id="34" w:name="_Toc226474441"/>
+      <w:bookmarkStart w:id="33" w:name="_Toc227147758"/>
       <w:r>
         <w:t>4.6.3 Járműkezelés (/api/admin/vehicles) – ADMIN</w:t>
       </w:r>
-      <w:bookmarkEnd w:id="34"/>
+      <w:bookmarkEnd w:id="33"/>
     </w:p>
     <w:tbl>
       <w:tblPr>
@@ -22958,19 +23030,20 @@
       </w:tr>
     </w:tbl>
     <w:p>
-      <w:pPr>
-        <w:spacing w:before="80" w:after="80"/>
-      </w:pPr>
+      <w:r>
+        <w:br w:type="page"/>
+      </w:r>
     </w:p>
     <w:p>
       <w:pPr>
         <w:pStyle w:val="Cmsor3"/>
       </w:pPr>
-      <w:bookmarkStart w:id="35" w:name="_Toc226474442"/>
-      <w:r>
+      <w:bookmarkStart w:id="34" w:name="_Toc227147759"/>
+      <w:r>
+        <w:lastRenderedPageBreak/>
         <w:t>4.6.4 Jármű–Sofőr hozzárendelés (/api/admin)</w:t>
       </w:r>
-      <w:bookmarkEnd w:id="35"/>
+      <w:bookmarkEnd w:id="34"/>
     </w:p>
     <w:tbl>
       <w:tblPr>
@@ -23024,7 +23097,6 @@
                 <w:sz w:val="18"/>
                 <w:szCs w:val="18"/>
               </w:rPr>
-              <w:lastRenderedPageBreak/>
               <w:t>Metódus</w:t>
             </w:r>
           </w:p>
@@ -23521,11 +23593,11 @@
       <w:pPr>
         <w:pStyle w:val="Cmsor3"/>
       </w:pPr>
-      <w:bookmarkStart w:id="36" w:name="_Toc226474443"/>
+      <w:bookmarkStart w:id="35" w:name="_Toc227147760"/>
       <w:r>
         <w:t>4.6.5 Útnyilvántartás (/api/trips)</w:t>
       </w:r>
-      <w:bookmarkEnd w:id="36"/>
+      <w:bookmarkEnd w:id="35"/>
     </w:p>
     <w:tbl>
       <w:tblPr>
@@ -24251,11 +24323,11 @@
       <w:pPr>
         <w:pStyle w:val="Cmsor3"/>
       </w:pPr>
-      <w:bookmarkStart w:id="37" w:name="_Toc226474444"/>
+      <w:bookmarkStart w:id="36" w:name="_Toc227147761"/>
       <w:r>
         <w:t>4.6.6 Üzemanyag-napló (/api/fuellogs)</w:t>
       </w:r>
-      <w:bookmarkEnd w:id="37"/>
+      <w:bookmarkEnd w:id="36"/>
     </w:p>
     <w:tbl>
       <w:tblPr>
@@ -24988,11 +25060,11 @@
       <w:pPr>
         <w:pStyle w:val="Cmsor3"/>
       </w:pPr>
-      <w:bookmarkStart w:id="38" w:name="_Toc226474445"/>
+      <w:bookmarkStart w:id="37" w:name="_Toc227147762"/>
       <w:r>
         <w:t>4.6.7 Szervizigények (/api/service-requests)</w:t>
       </w:r>
-      <w:bookmarkEnd w:id="38"/>
+      <w:bookmarkEnd w:id="37"/>
     </w:p>
     <w:tbl>
       <w:tblPr>
@@ -26203,11 +26275,12 @@
       <w:pPr>
         <w:pStyle w:val="Cmsor3"/>
       </w:pPr>
-      <w:bookmarkStart w:id="39" w:name="_Toc226474446"/>
-      <w:r>
+      <w:bookmarkStart w:id="38" w:name="_Toc227147763"/>
+      <w:r>
+        <w:lastRenderedPageBreak/>
         <w:t>4.6.8 Naptár (/api/calendarevents)</w:t>
       </w:r>
-      <w:bookmarkEnd w:id="39"/>
+      <w:bookmarkEnd w:id="38"/>
     </w:p>
     <w:tbl>
       <w:tblPr>
@@ -26261,7 +26334,6 @@
                 <w:sz w:val="18"/>
                 <w:szCs w:val="18"/>
               </w:rPr>
-              <w:lastRenderedPageBreak/>
               <w:t>Metódus</w:t>
             </w:r>
           </w:p>
@@ -26592,11 +26664,11 @@
       <w:pPr>
         <w:pStyle w:val="Cmsor3"/>
       </w:pPr>
-      <w:bookmarkStart w:id="40" w:name="_Toc226474447"/>
+      <w:bookmarkStart w:id="39" w:name="_Toc227147764"/>
       <w:r>
         <w:t>4.6.9 Értesítések (/api/notifications)</w:t>
       </w:r>
-      <w:bookmarkEnd w:id="40"/>
+      <w:bookmarkEnd w:id="39"/>
     </w:p>
     <w:tbl>
       <w:tblPr>
@@ -27153,11 +27225,11 @@
       <w:pPr>
         <w:pStyle w:val="Cmsor3"/>
       </w:pPr>
-      <w:bookmarkStart w:id="41" w:name="_Toc226474448"/>
+      <w:bookmarkStart w:id="40" w:name="_Toc227147765"/>
       <w:r>
         <w:t>4.6.10 Profil (/api/profile)</w:t>
       </w:r>
-      <w:bookmarkEnd w:id="41"/>
+      <w:bookmarkEnd w:id="40"/>
     </w:p>
     <w:tbl>
       <w:tblPr>
@@ -27986,11 +28058,11 @@
       <w:pPr>
         <w:pStyle w:val="Cmsor3"/>
       </w:pPr>
-      <w:bookmarkStart w:id="42" w:name="_Toc226474449"/>
+      <w:bookmarkStart w:id="41" w:name="_Toc227147766"/>
       <w:r>
         <w:t>4.6.11 Statisztikák (/api/statistics)</w:t>
       </w:r>
-      <w:bookmarkEnd w:id="42"/>
+      <w:bookmarkEnd w:id="41"/>
     </w:p>
     <w:tbl>
       <w:tblPr>
@@ -28921,19 +28993,20 @@
       </w:tr>
     </w:tbl>
     <w:p>
-      <w:pPr>
-        <w:spacing w:before="80" w:after="80"/>
-      </w:pPr>
+      <w:r>
+        <w:br w:type="page"/>
+      </w:r>
     </w:p>
     <w:p>
       <w:pPr>
         <w:pStyle w:val="Cmsor3"/>
       </w:pPr>
-      <w:bookmarkStart w:id="43" w:name="_Toc226474450"/>
-      <w:r>
+      <w:bookmarkStart w:id="42" w:name="_Toc227147767"/>
+      <w:r>
+        <w:lastRenderedPageBreak/>
         <w:t>4.6.12 Fájlkezelés (/api/files)</w:t>
       </w:r>
-      <w:bookmarkEnd w:id="43"/>
+      <w:bookmarkEnd w:id="42"/>
     </w:p>
     <w:tbl>
       <w:tblPr>
@@ -29248,7 +29321,6 @@
                 <w:sz w:val="18"/>
                 <w:szCs w:val="18"/>
               </w:rPr>
-              <w:lastRenderedPageBreak/>
               <w:t>DELETE</w:t>
             </w:r>
           </w:p>
@@ -29394,18 +29466,16 @@
     </w:tbl>
     <w:p>
       <w:pPr>
-        <w:spacing w:before="80" w:after="80"/>
-      </w:pPr>
-    </w:p>
-    <w:p>
-      <w:pPr>
         <w:pStyle w:val="Cmsor2"/>
       </w:pPr>
-      <w:bookmarkStart w:id="44" w:name="_Toc226474451"/>
+      <w:r>
+        <w:br/>
+      </w:r>
+      <w:bookmarkStart w:id="43" w:name="_Toc227147768"/>
       <w:r>
         <w:t>4.7 Lapozás és szűrés</w:t>
       </w:r>
-      <w:bookmarkEnd w:id="44"/>
+      <w:bookmarkEnd w:id="43"/>
     </w:p>
     <w:p>
       <w:pPr>
@@ -29892,22 +29962,22 @@
           <w:bottom w:val="single" w:sz="6" w:space="1" w:color="2E75B6"/>
         </w:pBdr>
       </w:pPr>
-      <w:bookmarkStart w:id="45" w:name="_Toc226474452"/>
+      <w:bookmarkStart w:id="44" w:name="_Toc227147769"/>
       <w:r>
         <w:lastRenderedPageBreak/>
         <w:t>5. Biztonság és rendszerszintű megoldások</w:t>
       </w:r>
+      <w:bookmarkEnd w:id="44"/>
+    </w:p>
+    <w:p>
+      <w:pPr>
+        <w:pStyle w:val="Cmsor2"/>
+      </w:pPr>
+      <w:bookmarkStart w:id="45" w:name="_Toc227147770"/>
+      <w:r>
+        <w:t>5.1 JWT alapú hitelesítés részletei</w:t>
+      </w:r>
       <w:bookmarkEnd w:id="45"/>
-    </w:p>
-    <w:p>
-      <w:pPr>
-        <w:pStyle w:val="Cmsor2"/>
-      </w:pPr>
-      <w:bookmarkStart w:id="46" w:name="_Toc226474453"/>
-      <w:r>
-        <w:t>5.1 JWT alapú hitelesítés részletei</w:t>
-      </w:r>
-      <w:bookmarkEnd w:id="46"/>
     </w:p>
     <w:p>
       <w:pPr>
@@ -29964,11 +30034,11 @@
       <w:pPr>
         <w:pStyle w:val="Cmsor2"/>
       </w:pPr>
-      <w:bookmarkStart w:id="47" w:name="_Toc226474454"/>
+      <w:bookmarkStart w:id="46" w:name="_Toc227147771"/>
       <w:r>
         <w:t>5.2 Middleware réteg</w:t>
       </w:r>
-      <w:bookmarkEnd w:id="47"/>
+      <w:bookmarkEnd w:id="46"/>
     </w:p>
     <w:p>
       <w:pPr>
@@ -30478,11 +30548,11 @@
       <w:pPr>
         <w:pStyle w:val="Cmsor2"/>
       </w:pPr>
-      <w:bookmarkStart w:id="48" w:name="_Toc226474455"/>
+      <w:bookmarkStart w:id="47" w:name="_Toc227147772"/>
       <w:r>
         <w:t>5.3 CORS konfiguráció</w:t>
       </w:r>
-      <w:bookmarkEnd w:id="48"/>
+      <w:bookmarkEnd w:id="47"/>
     </w:p>
     <w:p>
       <w:pPr>
@@ -30505,11 +30575,11 @@
       <w:pPr>
         <w:pStyle w:val="Cmsor2"/>
       </w:pPr>
-      <w:bookmarkStart w:id="49" w:name="_Toc226474456"/>
+      <w:bookmarkStart w:id="48" w:name="_Toc227147773"/>
       <w:r>
         <w:t>5.4 Adatvalidáció</w:t>
       </w:r>
-      <w:bookmarkEnd w:id="49"/>
+      <w:bookmarkEnd w:id="48"/>
     </w:p>
     <w:p>
       <w:pPr>
@@ -30524,19 +30594,20 @@
       </w:r>
     </w:p>
     <w:p>
-      <w:pPr>
-        <w:spacing w:before="80" w:after="80"/>
-      </w:pPr>
+      <w:r>
+        <w:br w:type="page"/>
+      </w:r>
     </w:p>
     <w:p>
       <w:pPr>
         <w:pStyle w:val="Cmsor2"/>
       </w:pPr>
-      <w:bookmarkStart w:id="50" w:name="_Toc226474457"/>
-      <w:r>
+      <w:bookmarkStart w:id="49" w:name="_Toc227147774"/>
+      <w:r>
+        <w:lastRenderedPageBreak/>
         <w:t>5.5 Soft delete mechanizmus</w:t>
       </w:r>
-      <w:bookmarkEnd w:id="50"/>
+      <w:bookmarkEnd w:id="49"/>
     </w:p>
     <w:p>
       <w:pPr>
@@ -30547,7 +30618,6 @@
         <w:rPr>
           <w:color w:val="000000"/>
         </w:rPr>
-        <w:lastRenderedPageBreak/>
         <w:t>Az utak (trips) és tankolási naplók (fuel_logs) nem kerülnek fizikailag törlésre az adatbázisból, hanem egy is_deleted jelzőmező állítódik igaz értékre. Ez biztosítja, hogy az adatok auditnaplózási célokból megőrződjenek, és adminisztrátor által visszaállíthatók legyenek.</w:t>
       </w:r>
     </w:p>
@@ -30577,11 +30647,11 @@
       <w:pPr>
         <w:pStyle w:val="Cmsor2"/>
       </w:pPr>
-      <w:bookmarkStart w:id="51" w:name="_Toc226474458"/>
+      <w:bookmarkStart w:id="50" w:name="_Toc227147775"/>
       <w:r>
         <w:t>5.6 Fájlfeltöltés és -kezelés</w:t>
       </w:r>
-      <w:bookmarkEnd w:id="51"/>
+      <w:bookmarkEnd w:id="50"/>
     </w:p>
     <w:p>
       <w:pPr>
@@ -30638,25 +30708,25 @@
           <w:bottom w:val="single" w:sz="6" w:space="1" w:color="2E75B6"/>
         </w:pBdr>
       </w:pPr>
-      <w:bookmarkStart w:id="52" w:name="_Toc226474459"/>
+      <w:bookmarkStart w:id="51" w:name="_Toc227147776"/>
       <w:r>
         <w:lastRenderedPageBreak/>
         <w:t>6. Backend tesztelés</w:t>
       </w:r>
+      <w:bookmarkEnd w:id="51"/>
+    </w:p>
+    <w:p>
+      <w:pPr>
+        <w:pStyle w:val="Cmsor2"/>
+      </w:pPr>
+      <w:bookmarkStart w:id="52" w:name="_Toc227147777"/>
+      <w:r>
+        <w:t>6</w:t>
+      </w:r>
+      <w:r>
+        <w:t>.1 Tesztelési megközelítés</w:t>
+      </w:r>
       <w:bookmarkEnd w:id="52"/>
-    </w:p>
-    <w:p>
-      <w:pPr>
-        <w:pStyle w:val="Cmsor2"/>
-      </w:pPr>
-      <w:bookmarkStart w:id="53" w:name="_Toc226474460"/>
-      <w:r>
-        <w:t>6</w:t>
-      </w:r>
-      <w:r>
-        <w:t>.1 Tesztelési megközelítés</w:t>
-      </w:r>
-      <w:bookmarkEnd w:id="53"/>
     </w:p>
     <w:p>
       <w:pPr>
@@ -30741,14 +30811,14 @@
       <w:pPr>
         <w:pStyle w:val="Cmsor2"/>
       </w:pPr>
-      <w:bookmarkStart w:id="54" w:name="_Toc226474461"/>
+      <w:bookmarkStart w:id="53" w:name="_Toc227147778"/>
       <w:r>
         <w:t>6</w:t>
       </w:r>
       <w:r>
         <w:t>.2 A tesztprojekt struktúrája</w:t>
       </w:r>
-      <w:bookmarkEnd w:id="54"/>
+      <w:bookmarkEnd w:id="53"/>
     </w:p>
     <w:p>
       <w:pPr>
@@ -31258,27 +31328,27 @@
       <w:pPr>
         <w:pStyle w:val="Cmsor2"/>
       </w:pPr>
-      <w:bookmarkStart w:id="55" w:name="_Toc226474462"/>
+      <w:bookmarkStart w:id="54" w:name="_Toc227147779"/>
       <w:r>
         <w:t>6</w:t>
       </w:r>
       <w:r>
         <w:t>.3 Tesztelési segédosztályok</w:t>
       </w:r>
+      <w:bookmarkEnd w:id="54"/>
+    </w:p>
+    <w:p>
+      <w:pPr>
+        <w:pStyle w:val="Cmsor3"/>
+      </w:pPr>
+      <w:bookmarkStart w:id="55" w:name="_Toc227147780"/>
+      <w:r>
+        <w:t>6</w:t>
+      </w:r>
+      <w:r>
+        <w:t>.3.1 TestDbContextFactory</w:t>
+      </w:r>
       <w:bookmarkEnd w:id="55"/>
-    </w:p>
-    <w:p>
-      <w:pPr>
-        <w:pStyle w:val="Cmsor3"/>
-      </w:pPr>
-      <w:bookmarkStart w:id="56" w:name="_Toc226474463"/>
-      <w:r>
-        <w:t>6</w:t>
-      </w:r>
-      <w:r>
-        <w:t>.3.1 TestDbContextFactory</w:t>
-      </w:r>
-      <w:bookmarkEnd w:id="56"/>
     </w:p>
     <w:p>
       <w:pPr>
@@ -31301,14 +31371,14 @@
       <w:pPr>
         <w:pStyle w:val="Cmsor3"/>
       </w:pPr>
-      <w:bookmarkStart w:id="57" w:name="_Toc226474464"/>
+      <w:bookmarkStart w:id="56" w:name="_Toc227147781"/>
       <w:r>
         <w:t>6</w:t>
       </w:r>
       <w:r>
         <w:t>.3.2 TestControllerFactory</w:t>
       </w:r>
-      <w:bookmarkEnd w:id="57"/>
+      <w:bookmarkEnd w:id="56"/>
     </w:p>
     <w:p>
       <w:pPr>
@@ -31395,7 +31465,19 @@
         <w:rPr>
           <w:color w:val="000000"/>
         </w:rPr>
-        <w:t xml:space="preserve"> konfigurációs értéke teszt módban http://localhost:5174 értékre van beállítva.</w:t>
+        <w:t xml:space="preserve"> konfigurációs értéke teszt módban </w:t>
+      </w:r>
+      <w:r>
+        <w:rPr>
+          <w:rStyle w:val="LinkChar"/>
+        </w:rPr>
+        <w:t>http://localhost:5174</w:t>
+      </w:r>
+      <w:r>
+        <w:rPr>
+          <w:color w:val="000000"/>
+        </w:rPr>
+        <w:t xml:space="preserve"> értékre van beállítva.</w:t>
       </w:r>
     </w:p>
     <w:p>
@@ -31407,27 +31489,27 @@
       <w:pPr>
         <w:pStyle w:val="Cmsor2"/>
       </w:pPr>
-      <w:bookmarkStart w:id="58" w:name="_Toc226474465"/>
+      <w:bookmarkStart w:id="57" w:name="_Toc227147782"/>
       <w:r>
         <w:t>6</w:t>
       </w:r>
       <w:r>
         <w:t>.4 Unit tesztek</w:t>
       </w:r>
+      <w:bookmarkEnd w:id="57"/>
+    </w:p>
+    <w:p>
+      <w:pPr>
+        <w:pStyle w:val="Cmsor3"/>
+      </w:pPr>
+      <w:bookmarkStart w:id="58" w:name="_Toc227147783"/>
+      <w:r>
+        <w:t>6</w:t>
+      </w:r>
+      <w:r>
+        <w:t>.4.1 OwnDataControllerTests</w:t>
+      </w:r>
       <w:bookmarkEnd w:id="58"/>
-    </w:p>
-    <w:p>
-      <w:pPr>
-        <w:pStyle w:val="Cmsor3"/>
-      </w:pPr>
-      <w:bookmarkStart w:id="59" w:name="_Toc226474466"/>
-      <w:r>
-        <w:t>6</w:t>
-      </w:r>
-      <w:r>
-        <w:t>.4.1 OwnDataControllerTests</w:t>
-      </w:r>
-      <w:bookmarkEnd w:id="59"/>
     </w:p>
     <w:p>
       <w:pPr>
@@ -31489,14 +31571,14 @@
       <w:pPr>
         <w:pStyle w:val="Cmsor3"/>
       </w:pPr>
-      <w:bookmarkStart w:id="60" w:name="_Toc226474467"/>
+      <w:bookmarkStart w:id="59" w:name="_Toc227147784"/>
       <w:r>
         <w:t>6</w:t>
       </w:r>
       <w:r>
         <w:t>.4.2 EmailServiceTests</w:t>
       </w:r>
-      <w:bookmarkEnd w:id="60"/>
+      <w:bookmarkEnd w:id="59"/>
     </w:p>
     <w:p>
       <w:pPr>
@@ -31553,14 +31635,14 @@
       <w:pPr>
         <w:pStyle w:val="Cmsor2"/>
       </w:pPr>
-      <w:bookmarkStart w:id="61" w:name="_Toc226474468"/>
+      <w:bookmarkStart w:id="60" w:name="_Toc227147785"/>
       <w:r>
         <w:t>6</w:t>
       </w:r>
       <w:r>
         <w:t>.5 API integrációs tesztek (Fetch Client kollekció)</w:t>
       </w:r>
-      <w:bookmarkEnd w:id="61"/>
+      <w:bookmarkEnd w:id="60"/>
     </w:p>
     <w:p>
       <w:pPr>
@@ -32479,14 +32561,14 @@
       <w:pPr>
         <w:pStyle w:val="Cmsor2"/>
       </w:pPr>
-      <w:bookmarkStart w:id="62" w:name="_Toc226474469"/>
+      <w:bookmarkStart w:id="61" w:name="_Toc227147786"/>
       <w:r>
         <w:t>6</w:t>
       </w:r>
       <w:r>
         <w:t>.6 CI/CD integrált tesztelés</w:t>
       </w:r>
-      <w:bookmarkEnd w:id="62"/>
+      <w:bookmarkEnd w:id="61"/>
     </w:p>
     <w:p>
       <w:pPr>
@@ -32499,11 +32581,6 @@
         </w:rPr>
         <w:t>A GitHub Actions CI/CD pipeline automatikusan futtatja az összes unit tesztet minden main branch-re kerülő push esetén. Két workflow gondoskodik erről:</w:t>
       </w:r>
-    </w:p>
-    <w:p>
-      <w:pPr>
-        <w:spacing w:before="80" w:after="80"/>
-      </w:pPr>
     </w:p>
     <w:p>
       <w:pPr>
@@ -32515,6 +32592,7 @@
         <w:spacing w:before="40" w:after="40"/>
       </w:pPr>
       <w:r>
+        <w:lastRenderedPageBreak/>
         <w:t>dotnet.yml – A .NET CI workflow elvégzi a build és a tesztek futtatását minden push esetén.</w:t>
       </w:r>
     </w:p>
@@ -32592,25 +32670,25 @@
           <w:bottom w:val="single" w:sz="6" w:space="1" w:color="2E75B6"/>
         </w:pBdr>
       </w:pPr>
-      <w:bookmarkStart w:id="63" w:name="_Toc226474470"/>
+      <w:bookmarkStart w:id="62" w:name="_Toc227147787"/>
       <w:r>
         <w:lastRenderedPageBreak/>
         <w:t>7. Konténerizáció és publikálás</w:t>
       </w:r>
+      <w:bookmarkEnd w:id="62"/>
+    </w:p>
+    <w:p>
+      <w:pPr>
+        <w:pStyle w:val="Cmsor2"/>
+      </w:pPr>
+      <w:bookmarkStart w:id="63" w:name="_Toc227147788"/>
+      <w:r>
+        <w:t>7</w:t>
+      </w:r>
+      <w:r>
+        <w:t>.1 Docker</w:t>
+      </w:r>
       <w:bookmarkEnd w:id="63"/>
-    </w:p>
-    <w:p>
-      <w:pPr>
-        <w:pStyle w:val="Cmsor2"/>
-      </w:pPr>
-      <w:bookmarkStart w:id="64" w:name="_Toc226474471"/>
-      <w:r>
-        <w:t>7</w:t>
-      </w:r>
-      <w:r>
-        <w:t>.1 Docker</w:t>
-      </w:r>
-      <w:bookmarkEnd w:id="64"/>
     </w:p>
     <w:p>
       <w:pPr>
@@ -33151,14 +33229,14 @@
       <w:pPr>
         <w:pStyle w:val="Cmsor2"/>
       </w:pPr>
-      <w:bookmarkStart w:id="65" w:name="_Toc226474472"/>
+      <w:bookmarkStart w:id="64" w:name="_Toc227147789"/>
       <w:r>
         <w:t>7</w:t>
       </w:r>
       <w:r>
         <w:t>.2 Kubernetes</w:t>
       </w:r>
-      <w:bookmarkEnd w:id="65"/>
+      <w:bookmarkEnd w:id="64"/>
     </w:p>
     <w:p>
       <w:pPr>
@@ -34000,14 +34078,14 @@
       <w:pPr>
         <w:pStyle w:val="Cmsor2"/>
       </w:pPr>
-      <w:bookmarkStart w:id="66" w:name="_Toc226474473"/>
+      <w:bookmarkStart w:id="65" w:name="_Toc227147790"/>
       <w:r>
         <w:t>7</w:t>
       </w:r>
       <w:r>
         <w:t>.3 CI/CD Pipeline</w:t>
       </w:r>
-      <w:bookmarkEnd w:id="66"/>
+      <w:bookmarkEnd w:id="65"/>
     </w:p>
     <w:p>
       <w:pPr>
@@ -34022,22 +34100,23 @@
       </w:r>
     </w:p>
     <w:p>
-      <w:pPr>
-        <w:spacing w:before="80" w:after="80"/>
-      </w:pPr>
+      <w:r>
+        <w:br w:type="page"/>
+      </w:r>
     </w:p>
     <w:p>
       <w:pPr>
         <w:pStyle w:val="Cmsor3"/>
       </w:pPr>
-      <w:bookmarkStart w:id="67" w:name="_Toc226474474"/>
-      <w:r>
+      <w:bookmarkStart w:id="66" w:name="_Toc227147791"/>
+      <w:r>
+        <w:lastRenderedPageBreak/>
         <w:t>7</w:t>
       </w:r>
       <w:r>
         <w:t>.3.1 .NET CI (dotnet.yml)</w:t>
       </w:r>
-      <w:bookmarkEnd w:id="67"/>
+      <w:bookmarkEnd w:id="66"/>
     </w:p>
     <w:p>
       <w:pPr>
@@ -34048,7 +34127,6 @@
         <w:rPr>
           <w:color w:val="000000"/>
         </w:rPr>
-        <w:lastRenderedPageBreak/>
         <w:t>Minden main branch push-ra fut. Elvégzi a kód checkout-ját, a .NET 10 SDK telepítését, a NuGet csomagok visszaállítását, a fordítást (build), és a tesztek futtatását.</w:t>
       </w:r>
     </w:p>
@@ -34061,14 +34139,14 @@
       <w:pPr>
         <w:pStyle w:val="Cmsor3"/>
       </w:pPr>
-      <w:bookmarkStart w:id="68" w:name="_Toc226474475"/>
+      <w:bookmarkStart w:id="67" w:name="_Toc227147792"/>
       <w:r>
         <w:t>7</w:t>
       </w:r>
       <w:r>
         <w:t>.3.2 Docker Build és Deploy (deploy.yml)</w:t>
       </w:r>
-      <w:bookmarkEnd w:id="68"/>
+      <w:bookmarkEnd w:id="67"/>
     </w:p>
     <w:p>
       <w:pPr>
@@ -34091,14 +34169,14 @@
       <w:pPr>
         <w:pStyle w:val="Cmsor3"/>
       </w:pPr>
-      <w:bookmarkStart w:id="69" w:name="_Toc226474476"/>
+      <w:bookmarkStart w:id="68" w:name="_Toc227147793"/>
       <w:r>
         <w:t>7</w:t>
       </w:r>
       <w:r>
         <w:t>.3.3 Android Build (android-build.yml – Mobil)</w:t>
       </w:r>
-      <w:bookmarkEnd w:id="69"/>
+      <w:bookmarkEnd w:id="68"/>
     </w:p>
     <w:p>
       <w:pPr>
@@ -34121,14 +34199,14 @@
       <w:pPr>
         <w:pStyle w:val="Cmsor2"/>
       </w:pPr>
-      <w:bookmarkStart w:id="70" w:name="_Toc226474477"/>
+      <w:bookmarkStart w:id="69" w:name="_Toc227147794"/>
       <w:r>
         <w:t>7</w:t>
       </w:r>
       <w:r>
         <w:t>.4 Fejlesztői futtatási kézikönyv</w:t>
       </w:r>
-      <w:bookmarkEnd w:id="70"/>
+      <w:bookmarkEnd w:id="69"/>
     </w:p>
     <w:p>
       <w:pPr>
@@ -34157,7 +34235,16 @@
         <w:spacing w:before="40" w:after="40"/>
       </w:pPr>
       <w:r>
-        <w:t>.NET 10 SDK (https://dotnet.microsoft.com/download)</w:t>
+        <w:t>.NET 10 SDK (</w:t>
+      </w:r>
+      <w:r>
+        <w:rPr>
+          <w:rStyle w:val="LinkChar"/>
+        </w:rPr>
+        <w:t>https://dotnet.microsoft.com/download</w:t>
+      </w:r>
+      <w:r>
+        <w:t>)</w:t>
       </w:r>
     </w:p>
     <w:p>
@@ -34558,37 +34645,61 @@
         <w:rPr>
           <w:color w:val="000000"/>
         </w:rPr>
-        <w:t>Az alkalmazás fejlesztési módban elérhető a http://localhost:5000 címen, a Swagger UI a http://localhost:5000/swagger oldalon.</w:t>
-      </w:r>
-    </w:p>
-    <w:p>
-      <w:pPr>
-        <w:spacing w:before="80" w:after="80"/>
-      </w:pPr>
-    </w:p>
-    <w:p>
-      <w:pPr>
-        <w:pStyle w:val="Cmsor2"/>
-      </w:pPr>
-      <w:bookmarkStart w:id="71" w:name="_Toc226474478"/>
-      <w:r>
-        <w:t>7</w:t>
-      </w:r>
-      <w:r>
-        <w:t>.5 Környezeti változók</w:t>
-      </w:r>
-      <w:bookmarkEnd w:id="71"/>
-    </w:p>
-    <w:p>
-      <w:pPr>
-        <w:spacing w:before="60" w:after="60" w:line="276" w:lineRule="auto"/>
-        <w:jc w:val="both"/>
-      </w:pPr>
+        <w:t xml:space="preserve">Az alkalmazás fejlesztési módban elérhető a </w:t>
+      </w:r>
+      <w:r>
+        <w:rPr>
+          <w:rStyle w:val="LinkChar"/>
+        </w:rPr>
+        <w:t>http://localhost:5000</w:t>
+      </w:r>
       <w:r>
         <w:rPr>
           <w:color w:val="000000"/>
         </w:rPr>
+        <w:t xml:space="preserve"> címen, a Swagger UI a </w:t>
+      </w:r>
+      <w:r>
+        <w:rPr>
+          <w:rStyle w:val="LinkChar"/>
+        </w:rPr>
+        <w:t>http://localhost:5000/swagger</w:t>
+      </w:r>
+      <w:r>
+        <w:rPr>
+          <w:color w:val="000000"/>
+        </w:rPr>
+        <w:t xml:space="preserve"> oldalon.</w:t>
+      </w:r>
+    </w:p>
+    <w:p>
+      <w:pPr>
+        <w:spacing w:before="80" w:after="80"/>
+      </w:pPr>
+    </w:p>
+    <w:p>
+      <w:pPr>
+        <w:pStyle w:val="Cmsor2"/>
+      </w:pPr>
+      <w:bookmarkStart w:id="70" w:name="_Toc227147795"/>
+      <w:r>
         <w:lastRenderedPageBreak/>
+        <w:t>7</w:t>
+      </w:r>
+      <w:r>
+        <w:t>.5 Környezeti változók</w:t>
+      </w:r>
+      <w:bookmarkEnd w:id="70"/>
+    </w:p>
+    <w:p>
+      <w:pPr>
+        <w:spacing w:before="60" w:after="60" w:line="276" w:lineRule="auto"/>
+        <w:jc w:val="both"/>
+      </w:pPr>
+      <w:r>
+        <w:rPr>
+          <w:color w:val="000000"/>
+        </w:rPr>
         <w:t xml:space="preserve">Az alkalmazás konfigurálásához a következő környezeti változókat kell beállítani (Docker/Kubernetes esetén ezek a </w:t>
       </w:r>
       <w:proofErr w:type="gramStart"/>
@@ -35756,14 +35867,14 @@
       <w:pPr>
         <w:pStyle w:val="Cmsor2"/>
       </w:pPr>
-      <w:bookmarkStart w:id="72" w:name="_Toc226474479"/>
+      <w:bookmarkStart w:id="71" w:name="_Toc227147796"/>
       <w:r>
         <w:t>7</w:t>
       </w:r>
       <w:r>
         <w:t>.6 GitHub Actions Secrets</w:t>
       </w:r>
-      <w:bookmarkEnd w:id="72"/>
+      <w:bookmarkEnd w:id="71"/>
     </w:p>
     <w:p>
       <w:pPr>
@@ -36297,36 +36408,31 @@
       </w:tr>
     </w:tbl>
     <w:p>
-      <w:r>
-        <w:br w:type="page"/>
-      </w:r>
-    </w:p>
-    <w:p>
       <w:pPr>
         <w:pStyle w:val="Cmsor1"/>
         <w:pBdr>
           <w:bottom w:val="single" w:sz="6" w:space="1" w:color="2E75B6"/>
         </w:pBdr>
       </w:pPr>
-      <w:bookmarkStart w:id="73" w:name="_Toc226474480"/>
+      <w:bookmarkStart w:id="72" w:name="_Toc227147797"/>
       <w:r>
         <w:lastRenderedPageBreak/>
         <w:t>8. Mobil alkalmazás</w:t>
       </w:r>
+      <w:bookmarkEnd w:id="72"/>
+    </w:p>
+    <w:p>
+      <w:pPr>
+        <w:pStyle w:val="Cmsor2"/>
+      </w:pPr>
+      <w:bookmarkStart w:id="73" w:name="_Toc227147798"/>
+      <w:r>
+        <w:t>8</w:t>
+      </w:r>
+      <w:r>
+        <w:t>.1 Technológia és architektúra</w:t>
+      </w:r>
       <w:bookmarkEnd w:id="73"/>
-    </w:p>
-    <w:p>
-      <w:pPr>
-        <w:pStyle w:val="Cmsor2"/>
-      </w:pPr>
-      <w:bookmarkStart w:id="74" w:name="_Toc226474481"/>
-      <w:r>
-        <w:t>8</w:t>
-      </w:r>
-      <w:r>
-        <w:t>.1 Technológia és architektúra</w:t>
-      </w:r>
-      <w:bookmarkEnd w:id="74"/>
     </w:p>
     <w:p>
       <w:pPr>
@@ -37107,8 +37213,17 @@
                 <w:sz w:val="18"/>
                 <w:szCs w:val="18"/>
               </w:rPr>
-              <w:t>Microsoft.Extensions.Http</w:t>
-            </w:r>
+              <w:t>Microsoft.Extensions.</w:t>
+            </w:r>
+            <w:bookmarkStart w:id="74" w:name="_GoBack"/>
+            <w:r>
+              <w:rPr>
+                <w:sz w:val="18"/>
+                <w:szCs w:val="18"/>
+              </w:rPr>
+              <w:t>Http</w:t>
+            </w:r>
+            <w:bookmarkEnd w:id="74"/>
             <w:proofErr w:type="gramEnd"/>
           </w:p>
         </w:tc>
@@ -37277,7 +37392,7 @@
       <w:pPr>
         <w:pStyle w:val="Cmsor2"/>
       </w:pPr>
-      <w:bookmarkStart w:id="75" w:name="_Toc226474482"/>
+      <w:bookmarkStart w:id="75" w:name="_Toc227147799"/>
       <w:r>
         <w:t>8</w:t>
       </w:r>
@@ -37385,7 +37500,7 @@
       <w:pPr>
         <w:pStyle w:val="Cmsor2"/>
       </w:pPr>
-      <w:bookmarkStart w:id="76" w:name="_Toc226474483"/>
+      <w:bookmarkStart w:id="76" w:name="_Toc227147800"/>
       <w:r>
         <w:t>8</w:t>
       </w:r>
@@ -37499,7 +37614,7 @@
       <w:pPr>
         <w:pStyle w:val="Cmsor2"/>
       </w:pPr>
-      <w:bookmarkStart w:id="77" w:name="_Toc226474484"/>
+      <w:bookmarkStart w:id="77" w:name="_Toc227147801"/>
       <w:r>
         <w:t>8</w:t>
       </w:r>
@@ -37512,7 +37627,7 @@
       <w:pPr>
         <w:pStyle w:val="Cmsor3"/>
       </w:pPr>
-      <w:bookmarkStart w:id="78" w:name="_Toc226474485"/>
+      <w:bookmarkStart w:id="78" w:name="_Toc227147802"/>
       <w:r>
         <w:t>8</w:t>
       </w:r>
@@ -37542,7 +37657,7 @@
       <w:pPr>
         <w:pStyle w:val="Cmsor3"/>
       </w:pPr>
-      <w:bookmarkStart w:id="79" w:name="_Toc226474486"/>
+      <w:bookmarkStart w:id="79" w:name="_Toc227147803"/>
       <w:r>
         <w:t>8</w:t>
       </w:r>
@@ -37572,7 +37687,7 @@
       <w:pPr>
         <w:pStyle w:val="Cmsor3"/>
       </w:pPr>
-      <w:bookmarkStart w:id="80" w:name="_Toc226474487"/>
+      <w:bookmarkStart w:id="80" w:name="_Toc227147804"/>
       <w:r>
         <w:t>8</w:t>
       </w:r>
@@ -37602,7 +37717,7 @@
       <w:pPr>
         <w:pStyle w:val="Cmsor3"/>
       </w:pPr>
-      <w:bookmarkStart w:id="81" w:name="_Toc226474488"/>
+      <w:bookmarkStart w:id="81" w:name="_Toc227147805"/>
       <w:r>
         <w:t>8</w:t>
       </w:r>
@@ -37632,7 +37747,7 @@
       <w:pPr>
         <w:pStyle w:val="Cmsor3"/>
       </w:pPr>
-      <w:bookmarkStart w:id="82" w:name="_Toc226474489"/>
+      <w:bookmarkStart w:id="82" w:name="_Toc227147806"/>
       <w:r>
         <w:t>8</w:t>
       </w:r>
@@ -37662,7 +37777,7 @@
       <w:pPr>
         <w:pStyle w:val="Cmsor3"/>
       </w:pPr>
-      <w:bookmarkStart w:id="83" w:name="_Toc226474490"/>
+      <w:bookmarkStart w:id="83" w:name="_Toc227147807"/>
       <w:r>
         <w:t>8</w:t>
       </w:r>
@@ -37684,16 +37799,17 @@
       </w:r>
     </w:p>
     <w:p>
-      <w:pPr>
-        <w:spacing w:before="80" w:after="80"/>
-      </w:pPr>
+      <w:r>
+        <w:br w:type="page"/>
+      </w:r>
     </w:p>
     <w:p>
       <w:pPr>
         <w:pStyle w:val="Cmsor3"/>
       </w:pPr>
-      <w:bookmarkStart w:id="84" w:name="_Toc226474491"/>
-      <w:r>
+      <w:bookmarkStart w:id="84" w:name="_Toc227147808"/>
+      <w:r>
+        <w:lastRenderedPageBreak/>
         <w:t>8</w:t>
       </w:r>
       <w:r>
@@ -37710,7 +37826,6 @@
         <w:rPr>
           <w:color w:val="000000"/>
         </w:rPr>
-        <w:lastRenderedPageBreak/>
         <w:t>A sofőr személyes adatait (név, e-mail, telefon, jogosítvány adatok) jeleníti meg, és lehetővé teszi azok szerkesztését. Profil- és jelszócsere is elvégezhető. Profilkép galériából vagy kamerával tölthető fel, vagy törölhető. A témabeállítás (Rendszer / Világos / Sötét) is itt érhető el, és Preferences-ben tárolódik. A kijelentkezés gomb a bejelentkezési képernyőre navigál vissza.</w:t>
       </w:r>
     </w:p>
@@ -37723,7 +37838,7 @@
       <w:pPr>
         <w:pStyle w:val="Cmsor2"/>
       </w:pPr>
-      <w:bookmarkStart w:id="85" w:name="_Toc226474492"/>
+      <w:bookmarkStart w:id="85" w:name="_Toc227147809"/>
       <w:r>
         <w:t>8</w:t>
       </w:r>
@@ -38477,7 +38592,7 @@
       <w:pPr>
         <w:pStyle w:val="Cmsor2"/>
       </w:pPr>
-      <w:bookmarkStart w:id="86" w:name="_Toc226474493"/>
+      <w:bookmarkStart w:id="86" w:name="_Toc227147810"/>
       <w:r>
         <w:t>8</w:t>
       </w:r>
@@ -38507,7 +38622,7 @@
       <w:pPr>
         <w:pStyle w:val="Cmsor3"/>
       </w:pPr>
-      <w:bookmarkStart w:id="87" w:name="_Toc226474494"/>
+      <w:bookmarkStart w:id="87" w:name="_Toc227147811"/>
       <w:r>
         <w:t>8</w:t>
       </w:r>
@@ -38537,7 +38652,7 @@
       <w:pPr>
         <w:pStyle w:val="Cmsor3"/>
       </w:pPr>
-      <w:bookmarkStart w:id="88" w:name="_Toc226474495"/>
+      <w:bookmarkStart w:id="88" w:name="_Toc227147812"/>
       <w:r>
         <w:t>8</w:t>
       </w:r>
@@ -38567,7 +38682,7 @@
       <w:pPr>
         <w:pStyle w:val="Cmsor3"/>
       </w:pPr>
-      <w:bookmarkStart w:id="89" w:name="_Toc226474496"/>
+      <w:bookmarkStart w:id="89" w:name="_Toc227147813"/>
       <w:r>
         <w:t>8</w:t>
       </w:r>
@@ -38589,16 +38704,17 @@
       </w:r>
     </w:p>
     <w:p>
-      <w:pPr>
-        <w:spacing w:before="80" w:after="80"/>
-      </w:pPr>
+      <w:r>
+        <w:br w:type="page"/>
+      </w:r>
     </w:p>
     <w:p>
       <w:pPr>
         <w:pStyle w:val="Cmsor2"/>
       </w:pPr>
-      <w:bookmarkStart w:id="90" w:name="_Toc226474497"/>
-      <w:r>
+      <w:bookmarkStart w:id="90" w:name="_Toc227147814"/>
+      <w:r>
+        <w:lastRenderedPageBreak/>
         <w:t>8</w:t>
       </w:r>
       <w:r>
@@ -38615,7 +38731,6 @@
         <w:rPr>
           <w:color w:val="000000"/>
         </w:rPr>
-        <w:lastRenderedPageBreak/>
         <w:t>A mobilalkalmazás adatmodelljei a backend API válaszait tükrözik. Minden modell egyszerű C# POCO (Plain Old CLR Object) osztály, amelyeket a JSON deszerializáláshoz használunk.</w:t>
       </w:r>
     </w:p>
@@ -39504,7 +39619,7 @@
       <w:pPr>
         <w:pStyle w:val="Cmsor2"/>
       </w:pPr>
-      <w:bookmarkStart w:id="91" w:name="_Toc226474498"/>
+      <w:bookmarkStart w:id="91" w:name="_Toc227147815"/>
       <w:r>
         <w:t>8</w:t>
       </w:r>
@@ -39935,16 +40050,17 @@
       </w:r>
     </w:p>
     <w:p>
-      <w:pPr>
-        <w:spacing w:before="80" w:after="80"/>
-      </w:pPr>
+      <w:r>
+        <w:br w:type="page"/>
+      </w:r>
     </w:p>
     <w:p>
       <w:pPr>
         <w:pStyle w:val="Cmsor2"/>
       </w:pPr>
-      <w:bookmarkStart w:id="92" w:name="_Toc226474499"/>
-      <w:r>
+      <w:bookmarkStart w:id="92" w:name="_Toc227147816"/>
+      <w:r>
+        <w:lastRenderedPageBreak/>
         <w:t>8</w:t>
       </w:r>
       <w:r>
@@ -40798,7 +40914,7 @@
         </w:pBdr>
       </w:pPr>
       <w:bookmarkStart w:id="93" w:name="_Toc225837665"/>
-      <w:bookmarkStart w:id="94" w:name="_Toc226474500"/>
+      <w:bookmarkStart w:id="94" w:name="_Toc227147817"/>
       <w:r>
         <w:lastRenderedPageBreak/>
         <w:t>9. Webes frontend</w:t>
@@ -40810,7 +40926,7 @@
       <w:pPr>
         <w:pStyle w:val="Cmsor2"/>
       </w:pPr>
-      <w:bookmarkStart w:id="95" w:name="_Toc226474501"/>
+      <w:bookmarkStart w:id="95" w:name="_Toc227147818"/>
       <w:r>
         <w:t>9.1 Technológia</w:t>
       </w:r>
@@ -41947,7 +42063,13 @@
         <w:jc w:val="both"/>
       </w:pPr>
       <w:r>
-        <w:t>Az alkalmazás élő URL-je: https://fleetflow.jcloud.jedlik.cloud</w:t>
+        <w:t xml:space="preserve">Az alkalmazás élő URL-je: </w:t>
+      </w:r>
+      <w:r>
+        <w:rPr>
+          <w:rStyle w:val="LinkChar"/>
+        </w:rPr>
+        <w:t>https://fleetflow.jcloud.jedlik.cloud</w:t>
       </w:r>
     </w:p>
     <w:p>
@@ -41959,7 +42081,7 @@
       <w:pPr>
         <w:pStyle w:val="Cmsor2"/>
       </w:pPr>
-      <w:bookmarkStart w:id="96" w:name="_Toc226474502"/>
+      <w:bookmarkStart w:id="96" w:name="_Toc227147819"/>
       <w:r>
         <w:t>9.2 Projektstruktúra</w:t>
       </w:r>
@@ -42290,7 +42412,7 @@
       <w:pPr>
         <w:pStyle w:val="Cmsor2"/>
       </w:pPr>
-      <w:bookmarkStart w:id="97" w:name="_Toc226474503"/>
+      <w:bookmarkStart w:id="97" w:name="_Toc227147820"/>
       <w:r>
         <w:t>9.3 Hitelesítés és AuthContext</w:t>
       </w:r>
@@ -42328,7 +42450,7 @@
       <w:pPr>
         <w:pStyle w:val="Cmsor2"/>
       </w:pPr>
-      <w:bookmarkStart w:id="98" w:name="_Toc226474504"/>
+      <w:bookmarkStart w:id="98" w:name="_Toc227147821"/>
       <w:r>
         <w:t>9.4 Oldalak és funkciók</w:t>
       </w:r>
@@ -42338,7 +42460,7 @@
       <w:pPr>
         <w:pStyle w:val="Cmsor3"/>
       </w:pPr>
-      <w:bookmarkStart w:id="99" w:name="_Toc226474505"/>
+      <w:bookmarkStart w:id="99" w:name="_Toc227147822"/>
       <w:r>
         <w:t>9.4.1 Bejelentkezés oldal</w:t>
       </w:r>
@@ -42362,7 +42484,7 @@
       <w:pPr>
         <w:pStyle w:val="Cmsor3"/>
       </w:pPr>
-      <w:bookmarkStart w:id="100" w:name="_Toc226474506"/>
+      <w:bookmarkStart w:id="100" w:name="_Toc227147823"/>
       <w:r>
         <w:t>9.4.2 Admin irányítópult (Dashboard)</w:t>
       </w:r>
@@ -42386,7 +42508,7 @@
       <w:pPr>
         <w:pStyle w:val="Cmsor3"/>
       </w:pPr>
-      <w:bookmarkStart w:id="101" w:name="_Toc226474507"/>
+      <w:bookmarkStart w:id="101" w:name="_Toc227147824"/>
       <w:r>
         <w:t>9.4.3 Járműkezelés</w:t>
       </w:r>
@@ -42410,7 +42532,7 @@
       <w:pPr>
         <w:pStyle w:val="Cmsor3"/>
       </w:pPr>
-      <w:bookmarkStart w:id="102" w:name="_Toc226474508"/>
+      <w:bookmarkStart w:id="102" w:name="_Toc227147825"/>
       <w:r>
         <w:t>9.4.4 Sofőrkezelés</w:t>
       </w:r>
@@ -42434,7 +42556,7 @@
       <w:pPr>
         <w:pStyle w:val="Cmsor3"/>
       </w:pPr>
-      <w:bookmarkStart w:id="103" w:name="_Toc226474509"/>
+      <w:bookmarkStart w:id="103" w:name="_Toc227147826"/>
       <w:r>
         <w:t>9.4.5 Útnyilvántartás</w:t>
       </w:r>
@@ -42450,16 +42572,17 @@
       </w:r>
     </w:p>
     <w:p>
-      <w:pPr>
-        <w:spacing w:before="80" w:after="80"/>
-      </w:pPr>
+      <w:r>
+        <w:br w:type="page"/>
+      </w:r>
     </w:p>
     <w:p>
       <w:pPr>
         <w:pStyle w:val="Cmsor3"/>
       </w:pPr>
-      <w:bookmarkStart w:id="104" w:name="_Toc226474510"/>
-      <w:r>
+      <w:bookmarkStart w:id="104" w:name="_Toc227147827"/>
+      <w:r>
+        <w:lastRenderedPageBreak/>
         <w:t>9.4.6 Üzemanyag-naplók</w:t>
       </w:r>
       <w:bookmarkEnd w:id="104"/>
@@ -42470,7 +42593,6 @@
         <w:jc w:val="both"/>
       </w:pPr>
       <w:r>
-        <w:lastRenderedPageBreak/>
         <w:t>Az összes tankolási bejegyzés megtekintése lapozható táblázatban, sofőr és időszak szerinti szűréssel. Az admin itt tekintheti meg a feltöltött bizonylat fotókat, és szükség esetén visszaállíthatja a soft delete-tel törölt bejegyzéseket. Statisztikai összesítők is megjelennek az üzemanyag-felhasználásról.</w:t>
       </w:r>
     </w:p>
@@ -42483,7 +42605,7 @@
       <w:pPr>
         <w:pStyle w:val="Cmsor3"/>
       </w:pPr>
-      <w:bookmarkStart w:id="105" w:name="_Toc226474511"/>
+      <w:bookmarkStart w:id="105" w:name="_Toc227147828"/>
       <w:r>
         <w:t>9.4.7 Szervizigények kezelése</w:t>
       </w:r>
@@ -42507,7 +42629,7 @@
       <w:pPr>
         <w:pStyle w:val="Cmsor3"/>
       </w:pPr>
-      <w:bookmarkStart w:id="106" w:name="_Toc226474512"/>
+      <w:bookmarkStart w:id="106" w:name="_Toc227147829"/>
       <w:r>
         <w:t>9.4.8 Sofőr irányítópult</w:t>
       </w:r>
@@ -42531,7 +42653,7 @@
       <w:pPr>
         <w:pStyle w:val="Cmsor3"/>
       </w:pPr>
-      <w:bookmarkStart w:id="107" w:name="_Toc226474513"/>
+      <w:bookmarkStart w:id="107" w:name="_Toc227147830"/>
       <w:r>
         <w:t>9.4.9 Sofőr saját oldalak</w:t>
       </w:r>
@@ -42555,7 +42677,7 @@
       <w:pPr>
         <w:pStyle w:val="Cmsor3"/>
       </w:pPr>
-      <w:bookmarkStart w:id="108" w:name="_Toc226474514"/>
+      <w:bookmarkStart w:id="108" w:name="_Toc227147831"/>
       <w:r>
         <w:t>9.4.10 Értesítések</w:t>
       </w:r>
@@ -42579,7 +42701,7 @@
       <w:pPr>
         <w:pStyle w:val="Cmsor2"/>
       </w:pPr>
-      <w:bookmarkStart w:id="109" w:name="_Toc226474515"/>
+      <w:bookmarkStart w:id="109" w:name="_Toc227147832"/>
       <w:r>
         <w:t>9.5 Reszponzivitás</w:t>
       </w:r>
@@ -42603,7 +42725,7 @@
       <w:pPr>
         <w:pStyle w:val="Cmsor2"/>
       </w:pPr>
-      <w:bookmarkStart w:id="110" w:name="_Toc226474516"/>
+      <w:bookmarkStart w:id="110" w:name="_Toc227147833"/>
       <w:r>
         <w:t>9.6 Webes tesztelés – Cypress E2E</w:t>
       </w:r>
@@ -42738,14 +42860,9 @@
     </w:p>
     <w:p>
       <w:pPr>
-        <w:spacing w:before="80" w:after="80"/>
-      </w:pPr>
-    </w:p>
-    <w:p>
-      <w:pPr>
         <w:pStyle w:val="Cmsor2"/>
       </w:pPr>
-      <w:bookmarkStart w:id="111" w:name="_Toc226474517"/>
+      <w:bookmarkStart w:id="111" w:name="_Toc227147834"/>
       <w:r>
         <w:lastRenderedPageBreak/>
         <w:t>9.7 Docker és Kubernetes</w:t>
@@ -43666,7 +43783,7 @@
       <w:pPr>
         <w:pStyle w:val="Cmsor2"/>
       </w:pPr>
-      <w:bookmarkStart w:id="112" w:name="_Toc226474518"/>
+      <w:bookmarkStart w:id="112" w:name="_Toc227147835"/>
       <w:r>
         <w:t>9.8 CI/CD pipeline</w:t>
       </w:r>
@@ -43718,7 +43835,7 @@
       <w:pPr>
         <w:pStyle w:val="Cmsor2"/>
       </w:pPr>
-      <w:bookmarkStart w:id="113" w:name="_Toc226474519"/>
+      <w:bookmarkStart w:id="113" w:name="_Toc227147836"/>
       <w:r>
         <w:t>9.9 Fejlesztői futtatási kézikönyv</w:t>
       </w:r>
@@ -43785,11 +43902,6 @@
     </w:p>
     <w:p>
       <w:pPr>
-        <w:spacing w:before="80" w:after="80"/>
-      </w:pPr>
-    </w:p>
-    <w:p>
-      <w:pPr>
         <w:shd w:val="clear" w:color="auto" w:fill="F0F0F0"/>
         <w:spacing w:before="60" w:after="60"/>
       </w:pPr>
@@ -43800,6 +43912,7 @@
           <w:sz w:val="18"/>
           <w:szCs w:val="18"/>
         </w:rPr>
+        <w:lastRenderedPageBreak/>
         <w:t># 2. Függőségek telepítése</w:t>
       </w:r>
     </w:p>
@@ -43969,7 +44082,16 @@
         <w:jc w:val="both"/>
       </w:pPr>
       <w:r>
-        <w:t>A fejlesztői szerver alapértelmezés szerint a http://localhost:5174 címen érhető el. A Vite konfigurációban API proxy van beállítva, amely az /api útvonalú kéréseket a backend szerverre irányítja.</w:t>
+        <w:t xml:space="preserve">A fejlesztői szerver alapértelmezés szerint a </w:t>
+      </w:r>
+      <w:r>
+        <w:rPr>
+          <w:rStyle w:val="LinkChar"/>
+        </w:rPr>
+        <w:t>http://localhost:5174</w:t>
+      </w:r>
+      <w:r>
+        <w:t xml:space="preserve"> címen érhető el. A Vite konfigurációban API proxy van beállítva, amely az /api útvonalú kéréseket a backend szerverre irányítja.</w:t>
       </w:r>
       <w:r>
         <w:br w:type="page"/>
@@ -43982,10 +44104,13 @@
           <w:bottom w:val="single" w:sz="6" w:space="1" w:color="2E75B6"/>
         </w:pBdr>
       </w:pPr>
-      <w:bookmarkStart w:id="114" w:name="_Toc226474520"/>
+      <w:bookmarkStart w:id="114" w:name="_Toc227147837"/>
       <w:r>
         <w:lastRenderedPageBreak/>
         <w:t>10. Források</w:t>
+      </w:r>
+      <w:r>
+        <w:t xml:space="preserve"> / Irodalomjegyzék</w:t>
       </w:r>
       <w:bookmarkEnd w:id="114"/>
     </w:p>
@@ -43999,7 +44124,13 @@
         <w:spacing w:before="40" w:after="40"/>
       </w:pPr>
       <w:r>
-        <w:t>Microsoft .NET Documentation: https://docs.microsoft.com/dotnet</w:t>
+        <w:t xml:space="preserve">Microsoft .NET Documentation: </w:t>
+      </w:r>
+      <w:r>
+        <w:rPr>
+          <w:rStyle w:val="LinkChar"/>
+        </w:rPr>
+        <w:t>https://docs.microsoft.com/dotnet</w:t>
       </w:r>
     </w:p>
     <w:p>
@@ -44012,7 +44143,13 @@
         <w:spacing w:before="40" w:after="40"/>
       </w:pPr>
       <w:r>
-        <w:t>ASP.NET Core Documentation: https://docs.microsoft.com/aspnet/core</w:t>
+        <w:t xml:space="preserve">ASP.NET Core Documentation: </w:t>
+      </w:r>
+      <w:r>
+        <w:rPr>
+          <w:rStyle w:val="LinkChar"/>
+        </w:rPr>
+        <w:t>https://docs.microsoft.com/aspnet/core</w:t>
       </w:r>
     </w:p>
     <w:p>
@@ -44025,7 +44162,13 @@
         <w:spacing w:before="40" w:after="40"/>
       </w:pPr>
       <w:r>
-        <w:t>Entity Framework Core: https://docs.microsoft.com/ef/core</w:t>
+        <w:t xml:space="preserve">Entity Framework Core: </w:t>
+      </w:r>
+      <w:r>
+        <w:rPr>
+          <w:rStyle w:val="LinkChar"/>
+        </w:rPr>
+        <w:t>https://docs.microsoft.com/ef/core</w:t>
       </w:r>
     </w:p>
     <w:p>
@@ -44036,9 +44179,18 @@
           <w:numId w:val="2"/>
         </w:numPr>
         <w:spacing w:before="40" w:after="40"/>
-      </w:pPr>
-      <w:r>
-        <w:t>MySQL 8.0 Reference Manual: https://dev.mysql.com/doc/refman/8.0/en/</w:t>
+        <w:rPr>
+          <w:rStyle w:val="LinkChar"/>
+        </w:rPr>
+      </w:pPr>
+      <w:r>
+        <w:t xml:space="preserve">MySQL 8.0 Reference Manual: </w:t>
+      </w:r>
+      <w:r>
+        <w:rPr>
+          <w:rStyle w:val="LinkChar"/>
+        </w:rPr>
+        <w:t>https://dev.mysql.com/doc/refman/8.0/en/</w:t>
       </w:r>
     </w:p>
     <w:p>
@@ -44049,9 +44201,18 @@
           <w:numId w:val="2"/>
         </w:numPr>
         <w:spacing w:before="40" w:after="40"/>
-      </w:pPr>
-      <w:r>
-        <w:t>.NET MAUI Documentation: https://docs.microsoft.com/dotnet/maui</w:t>
+        <w:rPr>
+          <w:rStyle w:val="LinkChar"/>
+        </w:rPr>
+      </w:pPr>
+      <w:r>
+        <w:t xml:space="preserve">.NET MAUI Documentation: </w:t>
+      </w:r>
+      <w:r>
+        <w:rPr>
+          <w:rStyle w:val="LinkChar"/>
+        </w:rPr>
+        <w:t>https://docs.microsoft.com/dotnet/maui</w:t>
       </w:r>
     </w:p>
     <w:p>
@@ -44062,9 +44223,18 @@
           <w:numId w:val="2"/>
         </w:numPr>
         <w:spacing w:before="40" w:after="40"/>
-      </w:pPr>
-      <w:r>
-        <w:t>CommunityToolkit.Mvvm: https://learn.microsoft.com/dotnet/communitytoolkit/mvvm/</w:t>
+        <w:rPr>
+          <w:rStyle w:val="LinkChar"/>
+        </w:rPr>
+      </w:pPr>
+      <w:r>
+        <w:t xml:space="preserve">CommunityToolkit.Mvvm: </w:t>
+      </w:r>
+      <w:r>
+        <w:rPr>
+          <w:rStyle w:val="LinkChar"/>
+        </w:rPr>
+        <w:t>https://learn.microsoft.com/dotnet/communitytoolkit/mvvm/</w:t>
       </w:r>
     </w:p>
     <w:p>
@@ -44075,9 +44245,18 @@
           <w:numId w:val="2"/>
         </w:numPr>
         <w:spacing w:before="40" w:after="40"/>
-      </w:pPr>
-      <w:r>
-        <w:t>JWT.io – JSON Web Tokens: https://jwt.io/</w:t>
+        <w:rPr>
+          <w:rStyle w:val="LinkChar"/>
+        </w:rPr>
+      </w:pPr>
+      <w:r>
+        <w:t xml:space="preserve">JWT.io – JSON Web Tokens: </w:t>
+      </w:r>
+      <w:r>
+        <w:rPr>
+          <w:rStyle w:val="LinkChar"/>
+        </w:rPr>
+        <w:t>https://jwt.io/</w:t>
       </w:r>
     </w:p>
     <w:p>
@@ -44090,7 +44269,13 @@
         <w:spacing w:before="40" w:after="40"/>
       </w:pPr>
       <w:r>
-        <w:t>BCrypt.Net Documentation: https://github.com/BcryptNet/bcrypt.net</w:t>
+        <w:t xml:space="preserve">BCrypt.Net Documentation: </w:t>
+      </w:r>
+      <w:r>
+        <w:rPr>
+          <w:rStyle w:val="LinkChar"/>
+        </w:rPr>
+        <w:t>https://github.com/BcryptNet/bcrypt.net</w:t>
       </w:r>
     </w:p>
     <w:p>
@@ -44101,9 +44286,18 @@
           <w:numId w:val="2"/>
         </w:numPr>
         <w:spacing w:before="40" w:after="40"/>
-      </w:pPr>
-      <w:r>
-        <w:t>Docker Documentation: https://docs.docker.com/</w:t>
+        <w:rPr>
+          <w:rStyle w:val="LinkChar"/>
+        </w:rPr>
+      </w:pPr>
+      <w:r>
+        <w:t xml:space="preserve">Docker Documentation: </w:t>
+      </w:r>
+      <w:r>
+        <w:rPr>
+          <w:rStyle w:val="LinkChar"/>
+        </w:rPr>
+        <w:t>https://docs.docker.com/</w:t>
       </w:r>
     </w:p>
     <w:p>
@@ -44116,7 +44310,13 @@
         <w:spacing w:before="40" w:after="40"/>
       </w:pPr>
       <w:r>
-        <w:t>Kubernetes Documentation: https://kubernetes.io/docs/</w:t>
+        <w:t xml:space="preserve">Kubernetes Documentation: </w:t>
+      </w:r>
+      <w:r>
+        <w:rPr>
+          <w:rStyle w:val="LinkChar"/>
+        </w:rPr>
+        <w:t>https://kubernetes.io/docs/</w:t>
       </w:r>
     </w:p>
     <w:p>
@@ -44129,7 +44329,13 @@
         <w:spacing w:before="40" w:after="40"/>
       </w:pPr>
       <w:r>
-        <w:t>GitHub Actions Documentation: https://docs.github.com/actions</w:t>
+        <w:t xml:space="preserve">GitHub Actions Documentation: </w:t>
+      </w:r>
+      <w:r>
+        <w:rPr>
+          <w:rStyle w:val="LinkChar"/>
+        </w:rPr>
+        <w:t>https://docs.github.com/actions</w:t>
       </w:r>
     </w:p>
     <w:p>
@@ -44140,9 +44346,18 @@
           <w:numId w:val="2"/>
         </w:numPr>
         <w:spacing w:before="40" w:after="40"/>
-      </w:pPr>
-      <w:r>
-        <w:t>Swagger / OpenAPI Initiative: https://swagger.io/</w:t>
+        <w:rPr>
+          <w:rStyle w:val="LinkChar"/>
+        </w:rPr>
+      </w:pPr>
+      <w:r>
+        <w:t xml:space="preserve">Swagger / OpenAPI Initiative: </w:t>
+      </w:r>
+      <w:r>
+        <w:rPr>
+          <w:rStyle w:val="LinkChar"/>
+        </w:rPr>
+        <w:t>https://swagger.io/</w:t>
       </w:r>
     </w:p>
     <w:p>
@@ -44153,9 +44368,18 @@
           <w:numId w:val="2"/>
         </w:numPr>
         <w:spacing w:before="40" w:after="40"/>
-      </w:pPr>
-      <w:r>
-        <w:t>xUnit Testing Framework: https://xunit.net/</w:t>
+        <w:rPr>
+          <w:rStyle w:val="LinkChar"/>
+        </w:rPr>
+      </w:pPr>
+      <w:r>
+        <w:t xml:space="preserve">xUnit Testing Framework: </w:t>
+      </w:r>
+      <w:r>
+        <w:rPr>
+          <w:rStyle w:val="LinkChar"/>
+        </w:rPr>
+        <w:t>https://xunit.net/</w:t>
       </w:r>
     </w:p>
     <w:p>
@@ -44168,7 +44392,13 @@
         <w:spacing w:before="40" w:after="40"/>
       </w:pPr>
       <w:r>
-        <w:t>Moq Mocking Library: https://github.com/moq/moq4</w:t>
+        <w:t xml:space="preserve">Moq Mocking Library: </w:t>
+      </w:r>
+      <w:r>
+        <w:rPr>
+          <w:rStyle w:val="LinkChar"/>
+        </w:rPr>
+        <w:t>https://github.com/moq/moq4</w:t>
       </w:r>
     </w:p>
     <w:p>
@@ -44200,11 +44430,17 @@
           <w:numId w:val="2"/>
         </w:numPr>
         <w:spacing w:before="40" w:after="40"/>
+        <w:rPr>
+          <w:rStyle w:val="LinkChar"/>
+        </w:rPr>
       </w:pPr>
       <w:r>
         <w:t xml:space="preserve">Cypress Documentation: </w:t>
       </w:r>
       <w:r>
+        <w:rPr>
+          <w:rStyle w:val="LinkChar"/>
+        </w:rPr>
         <w:t>https://docs.cypress.io/</w:t>
       </w:r>
     </w:p>
@@ -44216,9 +44452,18 @@
           <w:numId w:val="2"/>
         </w:numPr>
         <w:spacing w:before="40" w:after="40"/>
-      </w:pPr>
-      <w:r>
-        <w:t>Wikipedia – Kubernetes: https://hu.wikipedia.org/wiki/Kubernetes</w:t>
+        <w:rPr>
+          <w:rStyle w:val="LinkChar"/>
+        </w:rPr>
+      </w:pPr>
+      <w:r>
+        <w:t xml:space="preserve">Wikipedia – Kubernetes: </w:t>
+      </w:r>
+      <w:r>
+        <w:rPr>
+          <w:rStyle w:val="LinkChar"/>
+        </w:rPr>
+        <w:t>https://hu.wikipedia.org/wiki/Kubernetes</w:t>
       </w:r>
     </w:p>
     <w:p>
@@ -44229,9 +44474,18 @@
           <w:numId w:val="2"/>
         </w:numPr>
         <w:spacing w:before="40" w:after="40"/>
-      </w:pPr>
-      <w:r>
-        <w:t>Wikipedia – GitHub: https://hu.wikipedia.org/wiki/GitHub</w:t>
+        <w:rPr>
+          <w:rStyle w:val="LinkChar"/>
+        </w:rPr>
+      </w:pPr>
+      <w:r>
+        <w:t xml:space="preserve">Wikipedia – GitHub: </w:t>
+      </w:r>
+      <w:r>
+        <w:rPr>
+          <w:rStyle w:val="LinkChar"/>
+        </w:rPr>
+        <w:t>https://hu.wikipedia.org/wiki/GitHub</w:t>
       </w:r>
     </w:p>
     <w:p>
@@ -44242,9 +44496,18 @@
           <w:numId w:val="2"/>
         </w:numPr>
         <w:spacing w:before="40" w:after="40"/>
-      </w:pPr>
-      <w:r>
-        <w:t>Wikipedia – MySQL: https://hu.wikipedia.org/wiki/MySQL</w:t>
+        <w:rPr>
+          <w:rStyle w:val="LinkChar"/>
+        </w:rPr>
+      </w:pPr>
+      <w:r>
+        <w:t xml:space="preserve">Wikipedia – MySQL: </w:t>
+      </w:r>
+      <w:r>
+        <w:rPr>
+          <w:rStyle w:val="LinkChar"/>
+        </w:rPr>
+        <w:t>https://hu.wikipedia.org/wiki/MySQL</w:t>
       </w:r>
     </w:p>
     <w:sectPr>
@@ -44449,10 +44712,11 @@
   <w:abstractNum w:abstractNumId="0" w15:restartNumberingAfterBreak="0">
     <w:nsid w:val="00991889"/>
     <w:multiLevelType w:val="hybridMultilevel"/>
-    <w:tmpl w:val="CA42F882"/>
-    <w:lvl w:ilvl="0" w:tplc="42B0DE22">
+    <w:tmpl w:val="2DCC3BB0"/>
+    <w:lvl w:ilvl="0" w:tplc="31BA05EA">
       <w:start w:val="1"/>
       <w:numFmt w:val="bullet"/>
+      <w:pStyle w:val="Link"/>
       <w:lvlText w:val="•"/>
       <w:lvlJc w:val="left"/>
       <w:pPr>
@@ -45225,6 +45489,7 @@
   </w:style>
   <w:style w:type="paragraph" w:styleId="Listaszerbekezds">
     <w:name w:val="List Paragraph"/>
+    <w:link w:val="ListaszerbekezdsChar"/>
     <w:qFormat/>
   </w:style>
   <w:style w:type="character" w:styleId="Hiperhivatkozs">
@@ -45489,6 +45754,39 @@
         <w:right w:w="0" w:type="dxa"/>
       </w:tblCellMar>
     </w:tblPr>
+  </w:style>
+  <w:style w:type="paragraph" w:customStyle="1" w:styleId="Link">
+    <w:name w:val="Link"/>
+    <w:basedOn w:val="Listaszerbekezds"/>
+    <w:link w:val="LinkChar"/>
+    <w:qFormat/>
+    <w:rsid w:val="003B384C"/>
+    <w:pPr>
+      <w:numPr>
+        <w:numId w:val="2"/>
+      </w:numPr>
+      <w:spacing w:before="40" w:after="40"/>
+    </w:pPr>
+    <w:rPr>
+      <w:color w:val="0070C0"/>
+      <w:u w:val="single"/>
+    </w:rPr>
+  </w:style>
+  <w:style w:type="character" w:customStyle="1" w:styleId="ListaszerbekezdsChar">
+    <w:name w:val="Listaszerű bekezdés Char"/>
+    <w:basedOn w:val="Bekezdsalapbettpusa"/>
+    <w:link w:val="Listaszerbekezds"/>
+    <w:rsid w:val="003B384C"/>
+  </w:style>
+  <w:style w:type="character" w:customStyle="1" w:styleId="LinkChar">
+    <w:name w:val="Link Char"/>
+    <w:basedOn w:val="ListaszerbekezdsChar"/>
+    <w:link w:val="Link"/>
+    <w:rsid w:val="003B384C"/>
+    <w:rPr>
+      <w:color w:val="0070C0"/>
+      <w:u w:val="single"/>
+    </w:rPr>
   </w:style>
 </w:styles>
 </file>

</xml_diff>